<commit_message>
Update Checkpoint 7.1 worksheet artifacts
</commit_message>
<xml_diff>
--- a/Final_Capstone_Project/Capstone_Checkpoint_7.1/MHerrera_Capstone_Checkpoint_7_1_Worksheet.docx
+++ b/Final_Capstone_Project/Capstone_Checkpoint_7.1/MHerrera_Capstone_Checkpoint_7_1_Worksheet.docx
@@ -1,6 +1,6 @@
 
 <file path=word/document.xml><?xml version="1.0" encoding="utf-8"?>
-<w:document xmlns:wpc="http://schemas.microsoft.com/office/word/2010/wordprocessingCanvas" xmlns:cx="http://schemas.microsoft.com/office/drawing/2014/chartex" xmlns:cx1="http://schemas.microsoft.com/office/drawing/2015/9/8/chartex" xmlns:cx2="http://schemas.microsoft.com/office/drawing/2015/10/21/chartex" xmlns:cx3="http://schemas.microsoft.com/office/drawing/2016/5/9/chartex" xmlns:cx4="http://schemas.microsoft.com/office/drawing/2016/5/10/chartex" xmlns:cx5="http://schemas.microsoft.com/office/drawing/2016/5/11/chartex" xmlns:cx6="http://schemas.microsoft.com/office/drawing/2016/5/12/chartex" xmlns:cx7="http://schemas.microsoft.com/office/drawing/2016/5/13/chartex" xmlns:cx8="http://schemas.microsoft.com/office/drawing/2016/5/14/chartex" xmlns:mc="http://schemas.openxmlformats.org/markup-compatibility/2006" xmlns:aink="http://schemas.microsoft.com/office/drawing/2016/ink" xmlns:am3d="http://schemas.microsoft.com/office/drawing/2017/model3d" xmlns:o="urn:schemas-microsoft-com:office:office" xmlns:oel="http://schemas.microsoft.com/office/2019/extlst" xmlns:r="http://schemas.openxmlformats.org/officeDocument/2006/relationships" xmlns:m="http://schemas.openxmlformats.org/officeDocument/2006/math" xmlns:v="urn:schemas-microsoft-com:vml" xmlns:wp14="http://schemas.microsoft.com/office/word/2010/wordprocessingDrawing" xmlns:wp="http://schemas.openxmlformats.org/drawingml/2006/wordprocessingDrawing" xmlns:w10="urn:schemas-microsoft-com:office:word" xmlns:w="http://schemas.openxmlformats.org/wordprocessingml/2006/main" xmlns:w14="http://schemas.microsoft.com/office/word/2010/wordml" xmlns:w15="http://schemas.microsoft.com/office/word/2012/wordml" xmlns:w16cei="http://schemas.microsoft.com/office/word/2026/wordml/cei" xmlns:w16cex="http://schemas.microsoft.com/office/word/2018/wordml/cex" xmlns:w16cid="http://schemas.microsoft.com/office/word/2016/wordml/cid" xmlns:w16="http://schemas.microsoft.com/office/word/2018/wordml" xmlns:w16du="http://schemas.microsoft.com/office/word/2023/wordml/word16du" xmlns:w16sdtdh="http://schemas.microsoft.com/office/word/2020/wordml/sdtdatahash" xmlns:w16sdtfl="http://schemas.microsoft.com/office/word/2024/wordml/sdtformatlock" xmlns:w16se="http://schemas.microsoft.com/office/word/2015/wordml/symex" xmlns:wpg="http://schemas.microsoft.com/office/word/2010/wordprocessingGroup" xmlns:wpi="http://schemas.microsoft.com/office/word/2010/wordprocessingInk" xmlns:wne="http://schemas.microsoft.com/office/word/2006/wordml" xmlns:wps="http://schemas.microsoft.com/office/word/2010/wordprocessingShape" mc:Ignorable="w14 w15 w16se w16cid w16 w16cex w16sdtdh w16sdtfl w16du wp14">
+<w:document xmlns:wpc="http://schemas.microsoft.com/office/word/2010/wordprocessingCanvas" xmlns:cx="http://schemas.microsoft.com/office/drawing/2014/chartex" xmlns:cx1="http://schemas.microsoft.com/office/drawing/2015/9/8/chartex" xmlns:cx2="http://schemas.microsoft.com/office/drawing/2015/10/21/chartex" xmlns:cx3="http://schemas.microsoft.com/office/drawing/2016/5/9/chartex" xmlns:cx4="http://schemas.microsoft.com/office/drawing/2016/5/10/chartex" xmlns:cx5="http://schemas.microsoft.com/office/drawing/2016/5/11/chartex" xmlns:cx6="http://schemas.microsoft.com/office/drawing/2016/5/12/chartex" xmlns:cx7="http://schemas.microsoft.com/office/drawing/2016/5/13/chartex" xmlns:cx8="http://schemas.microsoft.com/office/drawing/2016/5/14/chartex" xmlns:mc="http://schemas.openxmlformats.org/markup-compatibility/2006" xmlns:m="http://schemas.openxmlformats.org/officeDocument/2006/math" xmlns:aink="http://schemas.microsoft.com/office/drawing/2016/ink" xmlns:am3d="http://schemas.microsoft.com/office/drawing/2017/model3d" xmlns:oel="http://schemas.microsoft.com/office/2019/extlst" xmlns:r="http://schemas.openxmlformats.org/officeDocument/2006/relationships" xmlns:wp14="http://schemas.microsoft.com/office/word/2010/wordprocessingDrawing" xmlns:wp="http://schemas.openxmlformats.org/drawingml/2006/wordprocessingDrawing" xmlns:wpg="http://schemas.microsoft.com/office/word/2010/wordprocessingGroup" xmlns:wpi="http://schemas.microsoft.com/office/word/2010/wordprocessingInk" xmlns:wps="http://schemas.microsoft.com/office/word/2010/wordprocessingShape" xmlns:o="urn:schemas-microsoft-com:office:office" xmlns:v="urn:schemas-microsoft-com:vml" xmlns:w10="urn:schemas-microsoft-com:office:word" xmlns:w="http://schemas.openxmlformats.org/wordprocessingml/2006/main" xmlns:w14="http://schemas.microsoft.com/office/word/2010/wordml" xmlns:w15="http://schemas.microsoft.com/office/word/2012/wordml" xmlns:w16cex="http://schemas.microsoft.com/office/word/2018/wordml/cex" xmlns:w16cid="http://schemas.microsoft.com/office/word/2016/wordml/cid" xmlns:w16="http://schemas.microsoft.com/office/word/2018/wordml" xmlns:w16sdtdh="http://schemas.microsoft.com/office/word/2020/wordml/sdtdatahash" xmlns:w16sdtfl="http://schemas.microsoft.com/office/word/2024/wordml/sdtformatlock" xmlns:w16se="http://schemas.microsoft.com/office/word/2015/wordml/symex" xmlns:w16du="http://schemas.microsoft.com/office/word/2023/wordml/word16du" xmlns:wne="http://schemas.microsoft.com/office/word/2006/wordml" mc:Ignorable="w14 w15 w16se w16cid w16 w16cex w16sdtdh w16sdtfl w16du wp14">
   <w:body>
     <w:p>
       <w:pPr>
@@ -324,6 +324,312 @@
         </w:pBdr>
         <w:spacing w:after="0"/>
         <w:rPr>
+          <w:rFonts w:eastAsia="Aptos"/>
+          <w:color w:val="000000"/>
+          <w:sz w:val="24"/>
+          <w:szCs w:val="24"/>
+        </w:rPr>
+      </w:pPr>
+    </w:p>
+    <w:p>
+      <w:pPr>
+        <w:pBdr>
+          <w:top w:val="nil"/>
+          <w:left w:val="nil"/>
+          <w:bottom w:val="nil"/>
+          <w:right w:val="nil"/>
+          <w:between w:val="nil"/>
+        </w:pBdr>
+        <w:spacing w:after="0"/>
+        <w:rPr>
+          <w:rFonts w:eastAsia="Aptos"/>
+          <w:color w:val="000000"/>
+          <w:sz w:val="24"/>
+          <w:szCs w:val="24"/>
+        </w:rPr>
+      </w:pPr>
+    </w:p>
+    <w:p>
+      <w:pPr>
+        <w:pBdr>
+          <w:top w:val="nil"/>
+          <w:left w:val="nil"/>
+          <w:bottom w:val="nil"/>
+          <w:right w:val="nil"/>
+          <w:between w:val="nil"/>
+        </w:pBdr>
+        <w:spacing w:after="0"/>
+        <w:rPr>
+          <w:rFonts w:eastAsia="Aptos"/>
+          <w:color w:val="000000"/>
+          <w:sz w:val="24"/>
+          <w:szCs w:val="24"/>
+        </w:rPr>
+      </w:pPr>
+    </w:p>
+    <w:p>
+      <w:pPr>
+        <w:pBdr>
+          <w:top w:val="nil"/>
+          <w:left w:val="nil"/>
+          <w:bottom w:val="nil"/>
+          <w:right w:val="nil"/>
+          <w:between w:val="nil"/>
+        </w:pBdr>
+        <w:spacing w:after="0"/>
+        <w:rPr>
+          <w:rFonts w:eastAsia="Aptos"/>
+          <w:color w:val="000000"/>
+          <w:sz w:val="24"/>
+          <w:szCs w:val="24"/>
+        </w:rPr>
+      </w:pPr>
+    </w:p>
+    <w:p>
+      <w:pPr>
+        <w:pBdr>
+          <w:top w:val="nil"/>
+          <w:left w:val="nil"/>
+          <w:bottom w:val="nil"/>
+          <w:right w:val="nil"/>
+          <w:between w:val="nil"/>
+        </w:pBdr>
+        <w:spacing w:after="0"/>
+        <w:rPr>
+          <w:rFonts w:eastAsia="Aptos"/>
+          <w:color w:val="000000"/>
+          <w:sz w:val="24"/>
+          <w:szCs w:val="24"/>
+        </w:rPr>
+      </w:pPr>
+    </w:p>
+    <w:p>
+      <w:pPr>
+        <w:pBdr>
+          <w:top w:val="nil"/>
+          <w:left w:val="nil"/>
+          <w:bottom w:val="nil"/>
+          <w:right w:val="nil"/>
+          <w:between w:val="nil"/>
+        </w:pBdr>
+        <w:spacing w:after="0"/>
+        <w:rPr>
+          <w:rFonts w:eastAsia="Aptos"/>
+          <w:color w:val="000000"/>
+          <w:sz w:val="24"/>
+          <w:szCs w:val="24"/>
+        </w:rPr>
+      </w:pPr>
+    </w:p>
+    <w:p>
+      <w:pPr>
+        <w:pBdr>
+          <w:top w:val="nil"/>
+          <w:left w:val="nil"/>
+          <w:bottom w:val="nil"/>
+          <w:right w:val="nil"/>
+          <w:between w:val="nil"/>
+        </w:pBdr>
+        <w:spacing w:after="0"/>
+        <w:rPr>
+          <w:rFonts w:eastAsia="Aptos"/>
+          <w:color w:val="000000"/>
+          <w:sz w:val="24"/>
+          <w:szCs w:val="24"/>
+        </w:rPr>
+      </w:pPr>
+    </w:p>
+    <w:p>
+      <w:pPr>
+        <w:pBdr>
+          <w:top w:val="nil"/>
+          <w:left w:val="nil"/>
+          <w:bottom w:val="nil"/>
+          <w:right w:val="nil"/>
+          <w:between w:val="nil"/>
+        </w:pBdr>
+        <w:spacing w:after="0"/>
+        <w:rPr>
+          <w:rFonts w:eastAsia="Aptos"/>
+          <w:color w:val="000000"/>
+          <w:sz w:val="24"/>
+          <w:szCs w:val="24"/>
+        </w:rPr>
+      </w:pPr>
+    </w:p>
+    <w:p>
+      <w:pPr>
+        <w:pBdr>
+          <w:top w:val="nil"/>
+          <w:left w:val="nil"/>
+          <w:bottom w:val="nil"/>
+          <w:right w:val="nil"/>
+          <w:between w:val="nil"/>
+        </w:pBdr>
+        <w:spacing w:after="0"/>
+        <w:rPr>
+          <w:rFonts w:eastAsia="Aptos"/>
+          <w:color w:val="000000"/>
+          <w:sz w:val="24"/>
+          <w:szCs w:val="24"/>
+        </w:rPr>
+      </w:pPr>
+    </w:p>
+    <w:p>
+      <w:pPr>
+        <w:pBdr>
+          <w:top w:val="nil"/>
+          <w:left w:val="nil"/>
+          <w:bottom w:val="nil"/>
+          <w:right w:val="nil"/>
+          <w:between w:val="nil"/>
+        </w:pBdr>
+        <w:spacing w:after="0"/>
+        <w:rPr>
+          <w:rFonts w:eastAsia="Aptos"/>
+          <w:color w:val="000000"/>
+          <w:sz w:val="24"/>
+          <w:szCs w:val="24"/>
+        </w:rPr>
+      </w:pPr>
+    </w:p>
+    <w:p>
+      <w:pPr>
+        <w:pBdr>
+          <w:top w:val="nil"/>
+          <w:left w:val="nil"/>
+          <w:bottom w:val="nil"/>
+          <w:right w:val="nil"/>
+          <w:between w:val="nil"/>
+        </w:pBdr>
+        <w:spacing w:after="0"/>
+        <w:rPr>
+          <w:rFonts w:eastAsia="Aptos"/>
+          <w:color w:val="000000"/>
+          <w:sz w:val="24"/>
+          <w:szCs w:val="24"/>
+        </w:rPr>
+      </w:pPr>
+    </w:p>
+    <w:p>
+      <w:pPr>
+        <w:pBdr>
+          <w:top w:val="nil"/>
+          <w:left w:val="nil"/>
+          <w:bottom w:val="nil"/>
+          <w:right w:val="nil"/>
+          <w:between w:val="nil"/>
+        </w:pBdr>
+        <w:spacing w:after="0"/>
+        <w:rPr>
+          <w:rFonts w:eastAsia="Aptos"/>
+          <w:color w:val="000000"/>
+          <w:sz w:val="24"/>
+          <w:szCs w:val="24"/>
+        </w:rPr>
+      </w:pPr>
+    </w:p>
+    <w:p>
+      <w:pPr>
+        <w:pBdr>
+          <w:top w:val="nil"/>
+          <w:left w:val="nil"/>
+          <w:bottom w:val="nil"/>
+          <w:right w:val="nil"/>
+          <w:between w:val="nil"/>
+        </w:pBdr>
+        <w:spacing w:after="0"/>
+        <w:rPr>
+          <w:rFonts w:eastAsia="Aptos"/>
+          <w:color w:val="000000"/>
+          <w:sz w:val="24"/>
+          <w:szCs w:val="24"/>
+        </w:rPr>
+      </w:pPr>
+    </w:p>
+    <w:p>
+      <w:pPr>
+        <w:pBdr>
+          <w:top w:val="nil"/>
+          <w:left w:val="nil"/>
+          <w:bottom w:val="nil"/>
+          <w:right w:val="nil"/>
+          <w:between w:val="nil"/>
+        </w:pBdr>
+        <w:spacing w:after="0"/>
+        <w:rPr>
+          <w:rFonts w:eastAsia="Aptos"/>
+          <w:color w:val="000000"/>
+          <w:sz w:val="24"/>
+          <w:szCs w:val="24"/>
+        </w:rPr>
+      </w:pPr>
+    </w:p>
+    <w:p>
+      <w:pPr>
+        <w:pBdr>
+          <w:top w:val="nil"/>
+          <w:left w:val="nil"/>
+          <w:bottom w:val="nil"/>
+          <w:right w:val="nil"/>
+          <w:between w:val="nil"/>
+        </w:pBdr>
+        <w:spacing w:after="0"/>
+        <w:rPr>
+          <w:rFonts w:eastAsia="Aptos"/>
+          <w:color w:val="000000"/>
+          <w:sz w:val="24"/>
+          <w:szCs w:val="24"/>
+        </w:rPr>
+      </w:pPr>
+    </w:p>
+    <w:p>
+      <w:pPr>
+        <w:pBdr>
+          <w:top w:val="nil"/>
+          <w:left w:val="nil"/>
+          <w:bottom w:val="nil"/>
+          <w:right w:val="nil"/>
+          <w:between w:val="nil"/>
+        </w:pBdr>
+        <w:spacing w:after="0"/>
+        <w:rPr>
+          <w:rFonts w:eastAsia="Aptos"/>
+          <w:color w:val="000000"/>
+          <w:sz w:val="24"/>
+          <w:szCs w:val="24"/>
+        </w:rPr>
+      </w:pPr>
+    </w:p>
+    <w:p>
+      <w:pPr>
+        <w:pBdr>
+          <w:top w:val="nil"/>
+          <w:left w:val="nil"/>
+          <w:bottom w:val="nil"/>
+          <w:right w:val="nil"/>
+          <w:between w:val="nil"/>
+        </w:pBdr>
+        <w:spacing w:after="0"/>
+        <w:rPr>
+          <w:rFonts w:eastAsia="Aptos"/>
+          <w:color w:val="000000"/>
+          <w:sz w:val="24"/>
+          <w:szCs w:val="24"/>
+        </w:rPr>
+      </w:pPr>
+    </w:p>
+    <w:p>
+      <w:pPr>
+        <w:pBdr>
+          <w:top w:val="nil"/>
+          <w:left w:val="nil"/>
+          <w:bottom w:val="nil"/>
+          <w:right w:val="nil"/>
+          <w:between w:val="nil"/>
+        </w:pBdr>
+        <w:spacing w:after="0"/>
+        <w:rPr>
           <w:rFonts w:ascii="Calibri" w:hAnsi="Calibri" w:cs="Calibri"/>
           <w:b/>
           <w:bCs/>
@@ -341,6 +647,7 @@
           <w:sz w:val="32"/>
           <w:szCs w:val="32"/>
         </w:rPr>
+        <w:lastRenderedPageBreak/>
         <w:t xml:space="preserve">Step </w:t>
       </w:r>
       <w:r>
@@ -494,17 +801,54 @@
                 <w:sz w:val="24"/>
                 <w:szCs w:val="24"/>
               </w:rPr>
-              <w:t>Response:</w:t>
-            </w:r>
-          </w:p>
-          <w:p>
-            <w:pPr>
-              <w:spacing w:after="120"/>
-              <w:rPr>
-                <w:sz w:val="24"/>
-                <w:szCs w:val="24"/>
-              </w:rPr>
-            </w:pPr>
+              <w:t xml:space="preserve">My capstone system is a Wikipedia Retrieval-Augmented Generation (RAG) system that uses both a fixed </w:t>
+            </w:r>
+            <w:r>
+              <w:rPr>
+                <w:sz w:val="24"/>
+                <w:szCs w:val="24"/>
+                <w:u w:val="single"/>
+              </w:rPr>
+              <w:t>Context-Aware</w:t>
+            </w:r>
+            <w:r>
+              <w:rPr>
+                <w:sz w:val="24"/>
+                <w:szCs w:val="24"/>
+              </w:rPr>
+              <w:t xml:space="preserve"> retrieval workflow and an </w:t>
+            </w:r>
+            <w:r>
+              <w:rPr>
+                <w:sz w:val="24"/>
+                <w:szCs w:val="24"/>
+                <w:u w:val="single"/>
+              </w:rPr>
+              <w:t>Agentic Dynamic</w:t>
+            </w:r>
+            <w:r>
+              <w:rPr>
+                <w:sz w:val="24"/>
+                <w:szCs w:val="24"/>
+              </w:rPr>
+              <w:t xml:space="preserve"> </w:t>
+            </w:r>
+            <w:proofErr w:type="spellStart"/>
+            <w:r>
+              <w:rPr>
+                <w:sz w:val="24"/>
+                <w:szCs w:val="24"/>
+              </w:rPr>
+              <w:t>ReAct</w:t>
+            </w:r>
+            <w:proofErr w:type="spellEnd"/>
+            <w:r>
+              <w:rPr>
+                <w:sz w:val="24"/>
+                <w:szCs w:val="24"/>
+              </w:rPr>
+              <w:t xml:space="preserve"> workflow. It supports lexical, semantic, hybrid, and Hybrid + Graph retrieval and uses RAGAS-based evaluation to measure answer correctness and failure cases.</w:t>
+            </w:r>
           </w:p>
         </w:tc>
       </w:tr>
@@ -593,17 +937,127 @@
                 <w:sz w:val="24"/>
                 <w:szCs w:val="24"/>
               </w:rPr>
-              <w:t>Response:</w:t>
+              <w:t>The system is designed to answer questions using evidence from a collection of Wikipedia articles. It supports</w:t>
+            </w:r>
+            <w:r>
+              <w:rPr>
+                <w:sz w:val="24"/>
+                <w:szCs w:val="24"/>
+              </w:rPr>
+              <w:t>:</w:t>
             </w:r>
           </w:p>
           <w:p>
             <w:pPr>
+              <w:pStyle w:val="ListParagraph"/>
+              <w:numPr>
+                <w:ilvl w:val="0"/>
+                <w:numId w:val="31"/>
+              </w:numPr>
               <w:spacing w:after="120"/>
               <w:rPr>
                 <w:sz w:val="24"/>
                 <w:szCs w:val="24"/>
               </w:rPr>
             </w:pPr>
+            <w:r>
+              <w:rPr>
+                <w:sz w:val="24"/>
+                <w:szCs w:val="24"/>
+              </w:rPr>
+              <w:t>F</w:t>
+            </w:r>
+            <w:r>
+              <w:rPr>
+                <w:sz w:val="24"/>
+                <w:szCs w:val="24"/>
+              </w:rPr>
+              <w:t>actual retrieval</w:t>
+            </w:r>
+          </w:p>
+          <w:p>
+            <w:pPr>
+              <w:pStyle w:val="ListParagraph"/>
+              <w:numPr>
+                <w:ilvl w:val="0"/>
+                <w:numId w:val="31"/>
+              </w:numPr>
+              <w:spacing w:after="120"/>
+              <w:rPr>
+                <w:sz w:val="24"/>
+                <w:szCs w:val="24"/>
+              </w:rPr>
+            </w:pPr>
+            <w:r>
+              <w:rPr>
+                <w:sz w:val="24"/>
+                <w:szCs w:val="24"/>
+              </w:rPr>
+              <w:t>C</w:t>
+            </w:r>
+            <w:r>
+              <w:rPr>
+                <w:sz w:val="24"/>
+                <w:szCs w:val="24"/>
+              </w:rPr>
+              <w:t>ross-document synthesis</w:t>
+            </w:r>
+          </w:p>
+          <w:p>
+            <w:pPr>
+              <w:pStyle w:val="ListParagraph"/>
+              <w:numPr>
+                <w:ilvl w:val="0"/>
+                <w:numId w:val="31"/>
+              </w:numPr>
+              <w:spacing w:after="120"/>
+              <w:rPr>
+                <w:sz w:val="24"/>
+                <w:szCs w:val="24"/>
+              </w:rPr>
+            </w:pPr>
+            <w:r>
+              <w:rPr>
+                <w:sz w:val="24"/>
+                <w:szCs w:val="24"/>
+              </w:rPr>
+              <w:t>E</w:t>
+            </w:r>
+            <w:r>
+              <w:rPr>
+                <w:sz w:val="24"/>
+                <w:szCs w:val="24"/>
+              </w:rPr>
+              <w:t xml:space="preserve">xact quotation questions and </w:t>
+            </w:r>
+          </w:p>
+          <w:p>
+            <w:pPr>
+              <w:pStyle w:val="ListParagraph"/>
+              <w:numPr>
+                <w:ilvl w:val="0"/>
+                <w:numId w:val="31"/>
+              </w:numPr>
+              <w:spacing w:after="120"/>
+              <w:rPr>
+                <w:sz w:val="24"/>
+                <w:szCs w:val="24"/>
+              </w:rPr>
+            </w:pPr>
+            <w:r>
+              <w:rPr>
+                <w:sz w:val="24"/>
+                <w:szCs w:val="24"/>
+              </w:rPr>
+              <w:t>A</w:t>
+            </w:r>
+            <w:r>
+              <w:rPr>
+                <w:sz w:val="24"/>
+                <w:szCs w:val="24"/>
+              </w:rPr>
+              <w:t>bstention when the requested information is not available in the corpus.</w:t>
+            </w:r>
           </w:p>
         </w:tc>
       </w:tr>
@@ -646,7 +1100,6 @@
     </w:p>
     <w:p>
       <w:pPr>
-        <w:spacing w:after="0"/>
         <w:rPr>
           <w:rFonts w:ascii="Calibri" w:hAnsi="Calibri" w:cs="Calibri"/>
           <w:b/>
@@ -656,7 +1109,9 @@
           <w:szCs w:val="32"/>
         </w:rPr>
       </w:pPr>
-      <w:r>
+    </w:p>
+    <w:p>
+      <w:pPr>
         <w:rPr>
           <w:rFonts w:ascii="Calibri" w:hAnsi="Calibri" w:cs="Calibri"/>
           <w:b/>
@@ -665,6 +1120,78 @@
           <w:sz w:val="32"/>
           <w:szCs w:val="32"/>
         </w:rPr>
+      </w:pPr>
+    </w:p>
+    <w:p>
+      <w:pPr>
+        <w:rPr>
+          <w:rFonts w:ascii="Calibri" w:hAnsi="Calibri" w:cs="Calibri"/>
+          <w:b/>
+          <w:bCs/>
+          <w:color w:val="A21F34"/>
+          <w:sz w:val="32"/>
+          <w:szCs w:val="32"/>
+        </w:rPr>
+      </w:pPr>
+    </w:p>
+    <w:p>
+      <w:pPr>
+        <w:rPr>
+          <w:rFonts w:ascii="Calibri" w:hAnsi="Calibri" w:cs="Calibri"/>
+          <w:b/>
+          <w:bCs/>
+          <w:color w:val="A21F34"/>
+          <w:sz w:val="32"/>
+          <w:szCs w:val="32"/>
+        </w:rPr>
+      </w:pPr>
+    </w:p>
+    <w:p>
+      <w:pPr>
+        <w:rPr>
+          <w:rFonts w:ascii="Calibri" w:hAnsi="Calibri" w:cs="Calibri"/>
+          <w:b/>
+          <w:bCs/>
+          <w:color w:val="A21F34"/>
+          <w:sz w:val="32"/>
+          <w:szCs w:val="32"/>
+        </w:rPr>
+      </w:pPr>
+    </w:p>
+    <w:p>
+      <w:pPr>
+        <w:rPr>
+          <w:rFonts w:ascii="Calibri" w:hAnsi="Calibri" w:cs="Calibri"/>
+          <w:b/>
+          <w:bCs/>
+          <w:color w:val="A21F34"/>
+          <w:sz w:val="32"/>
+          <w:szCs w:val="32"/>
+        </w:rPr>
+      </w:pPr>
+    </w:p>
+    <w:p>
+      <w:pPr>
+        <w:spacing w:after="0"/>
+        <w:rPr>
+          <w:rFonts w:ascii="Calibri" w:hAnsi="Calibri" w:cs="Calibri"/>
+          <w:b/>
+          <w:bCs/>
+          <w:color w:val="A21F34"/>
+          <w:sz w:val="32"/>
+          <w:szCs w:val="32"/>
+        </w:rPr>
+      </w:pPr>
+      <w:r>
+        <w:rPr>
+          <w:rFonts w:ascii="Calibri" w:hAnsi="Calibri" w:cs="Calibri"/>
+          <w:b/>
+          <w:bCs/>
+          <w:color w:val="A21F34"/>
+          <w:sz w:val="32"/>
+          <w:szCs w:val="32"/>
+        </w:rPr>
+        <w:lastRenderedPageBreak/>
         <w:t xml:space="preserve">Step </w:t>
       </w:r>
       <w:r>
@@ -863,17 +1390,70 @@
                 <w:sz w:val="24"/>
                 <w:szCs w:val="24"/>
               </w:rPr>
-              <w:t>Response:</w:t>
-            </w:r>
-          </w:p>
-          <w:p>
-            <w:pPr>
-              <w:spacing w:after="120"/>
-              <w:rPr>
-                <w:sz w:val="24"/>
-                <w:szCs w:val="24"/>
-              </w:rPr>
-            </w:pPr>
+              <w:t xml:space="preserve">I implemented a </w:t>
+            </w:r>
+            <w:r>
+              <w:rPr>
+                <w:sz w:val="24"/>
+                <w:szCs w:val="24"/>
+                <w:u w:val="single"/>
+              </w:rPr>
+              <w:t>hardened retrieval</w:t>
+            </w:r>
+            <w:r>
+              <w:rPr>
+                <w:sz w:val="24"/>
+                <w:szCs w:val="24"/>
+              </w:rPr>
+              <w:t xml:space="preserve"> and answer workflow designed to improve </w:t>
+            </w:r>
+            <w:r>
+              <w:rPr>
+                <w:b/>
+                <w:bCs/>
+                <w:sz w:val="24"/>
+                <w:szCs w:val="24"/>
+                <w:u w:val="single"/>
+              </w:rPr>
+              <w:t>evidence verification</w:t>
+            </w:r>
+            <w:r>
+              <w:rPr>
+                <w:sz w:val="24"/>
+                <w:szCs w:val="24"/>
+              </w:rPr>
+              <w:t xml:space="preserve"> before retrieved content is used to generate an answer. The safeguard emphasizes </w:t>
+            </w:r>
+            <w:r>
+              <w:rPr>
+                <w:sz w:val="24"/>
+                <w:szCs w:val="24"/>
+                <w:u w:val="single"/>
+              </w:rPr>
+              <w:t>distinguishing</w:t>
+            </w:r>
+            <w:r>
+              <w:rPr>
+                <w:sz w:val="24"/>
+                <w:szCs w:val="24"/>
+              </w:rPr>
+              <w:t xml:space="preserve"> potentially untrusted corpus content from independently supported evidence and improving abstention when the available evidence is insufficient. I evaluated the hardened workflow against the same </w:t>
+            </w:r>
+            <w:r>
+              <w:rPr>
+                <w:sz w:val="24"/>
+                <w:szCs w:val="24"/>
+                <w:u w:val="single"/>
+              </w:rPr>
+              <w:t xml:space="preserve">five diagnostic questions </w:t>
+            </w:r>
+            <w:r>
+              <w:rPr>
+                <w:sz w:val="24"/>
+                <w:szCs w:val="24"/>
+              </w:rPr>
+              <w:t>used for the baseline, covering cross-document synthesis, corpus-poisoning and factual retrieval, out-of-corpus abstention, and quotation fidelity.</w:t>
+            </w:r>
           </w:p>
         </w:tc>
       </w:tr>
@@ -957,17 +1537,23 @@
                 <w:sz w:val="24"/>
                 <w:szCs w:val="24"/>
               </w:rPr>
-              <w:t>Response:</w:t>
-            </w:r>
-          </w:p>
-          <w:p>
-            <w:pPr>
-              <w:spacing w:after="120"/>
-              <w:rPr>
-                <w:sz w:val="24"/>
-                <w:szCs w:val="24"/>
-              </w:rPr>
-            </w:pPr>
+              <w:t xml:space="preserve">The safeguard addresses the risk of treating retrieved or </w:t>
+            </w:r>
+            <w:r>
+              <w:rPr>
+                <w:sz w:val="24"/>
+                <w:szCs w:val="24"/>
+                <w:u w:val="single"/>
+              </w:rPr>
+              <w:t>potentially manipulated corpus content as trustworthy evidence</w:t>
+            </w:r>
+            <w:r>
+              <w:rPr>
+                <w:sz w:val="24"/>
+                <w:szCs w:val="24"/>
+              </w:rPr>
+              <w:t>. It also addresses reliability problems involving unsupported claims, cross-document reasoning, and questions that cannot be answered from the available corpus.</w:t>
+            </w:r>
           </w:p>
         </w:tc>
       </w:tr>
@@ -1051,17 +1637,39 @@
                 <w:sz w:val="24"/>
                 <w:szCs w:val="24"/>
               </w:rPr>
-              <w:t>Response:</w:t>
-            </w:r>
-          </w:p>
-          <w:p>
-            <w:pPr>
-              <w:spacing w:after="120"/>
-              <w:rPr>
-                <w:sz w:val="24"/>
-                <w:szCs w:val="24"/>
-              </w:rPr>
-            </w:pPr>
+              <w:t xml:space="preserve">I selected this safeguard because </w:t>
+            </w:r>
+            <w:r>
+              <w:rPr>
+                <w:sz w:val="24"/>
+                <w:szCs w:val="24"/>
+                <w:u w:val="single"/>
+              </w:rPr>
+              <w:t>Checkpoint 6.1 showed that some configurations did not reliably distinguish potentially untrusted retrieved content from independently supported evidence</w:t>
+            </w:r>
+            <w:r>
+              <w:rPr>
+                <w:sz w:val="24"/>
+                <w:szCs w:val="24"/>
+              </w:rPr>
+              <w:t xml:space="preserve">. The hardening tests were designed to improve evidence handling without replacing the existing RAG architecture. </w:t>
+            </w:r>
+            <w:r>
+              <w:rPr>
+                <w:b/>
+                <w:bCs/>
+                <w:sz w:val="24"/>
+                <w:szCs w:val="24"/>
+              </w:rPr>
+              <w:t>The results were mixed across configurations,</w:t>
+            </w:r>
+            <w:r>
+              <w:rPr>
+                <w:sz w:val="24"/>
+                <w:szCs w:val="24"/>
+              </w:rPr>
+              <w:t xml:space="preserve"> so the safeguard is treated as a targeted reliability improvement rather than a universal improvement.</w:t>
+            </w:r>
           </w:p>
         </w:tc>
       </w:tr>
@@ -1076,9 +1684,50 @@
     </w:p>
     <w:p>
       <w:pPr>
+        <w:rPr>
+          <w:sz w:val="24"/>
+          <w:szCs w:val="24"/>
+        </w:rPr>
+      </w:pPr>
+    </w:p>
+    <w:p>
+      <w:pPr>
+        <w:rPr>
+          <w:sz w:val="24"/>
+          <w:szCs w:val="24"/>
+        </w:rPr>
+      </w:pPr>
+    </w:p>
+    <w:p>
+      <w:pPr>
+        <w:rPr>
+          <w:sz w:val="24"/>
+          <w:szCs w:val="24"/>
+        </w:rPr>
+      </w:pPr>
+    </w:p>
+    <w:p>
+      <w:pPr>
+        <w:rPr>
+          <w:sz w:val="24"/>
+          <w:szCs w:val="24"/>
+        </w:rPr>
+      </w:pPr>
+    </w:p>
+    <w:p>
+      <w:pPr>
+        <w:rPr>
+          <w:sz w:val="24"/>
+          <w:szCs w:val="24"/>
+        </w:rPr>
+      </w:pPr>
+    </w:p>
+    <w:p>
+      <w:pPr>
         <w:pStyle w:val="Heading1"/>
       </w:pPr>
       <w:r>
+        <w:lastRenderedPageBreak/>
         <w:t xml:space="preserve">Step </w:t>
       </w:r>
       <w:r>
@@ -1207,24 +1856,72 @@
                 <w:sz w:val="24"/>
                 <w:szCs w:val="24"/>
               </w:rPr>
-              <w:t>Response:</w:t>
-            </w:r>
-          </w:p>
-          <w:p>
-            <w:pPr>
-              <w:spacing w:after="120"/>
-              <w:rPr>
-                <w:sz w:val="24"/>
-                <w:szCs w:val="24"/>
-              </w:rPr>
-            </w:pPr>
+              <w:t xml:space="preserve">I implemented and evaluated two optimization strategies: </w:t>
+            </w:r>
+            <w:r>
+              <w:rPr>
+                <w:sz w:val="24"/>
+                <w:szCs w:val="24"/>
+                <w:u w:val="single"/>
+              </w:rPr>
+              <w:t>model selection</w:t>
+            </w:r>
+            <w:r>
+              <w:rPr>
+                <w:sz w:val="24"/>
+                <w:szCs w:val="24"/>
+              </w:rPr>
+              <w:t xml:space="preserve"> and </w:t>
+            </w:r>
+            <w:r>
+              <w:rPr>
+                <w:sz w:val="24"/>
+                <w:szCs w:val="24"/>
+                <w:u w:val="single"/>
+              </w:rPr>
+              <w:t>retrieval-engine selection</w:t>
+            </w:r>
+            <w:r>
+              <w:rPr>
+                <w:sz w:val="24"/>
+                <w:szCs w:val="24"/>
+              </w:rPr>
+              <w:t xml:space="preserve">. I compared GPT-4o-mini with GPT-5.4-mini and compared the fixed Context-Aware workflow with the Agentic Dynamic workflow using the same five-question diagnostic set. The goal was to </w:t>
+            </w:r>
+            <w:r>
+              <w:rPr>
+                <w:sz w:val="24"/>
+                <w:szCs w:val="24"/>
+                <w:u w:val="single"/>
+              </w:rPr>
+              <w:t>identify configurations</w:t>
+            </w:r>
+            <w:r>
+              <w:rPr>
+                <w:sz w:val="24"/>
+                <w:szCs w:val="24"/>
+              </w:rPr>
+              <w:t xml:space="preserve"> that provide an appropriate </w:t>
+            </w:r>
+            <w:r>
+              <w:rPr>
+                <w:sz w:val="24"/>
+                <w:szCs w:val="24"/>
+                <w:u w:val="single"/>
+              </w:rPr>
+              <w:t>balance</w:t>
+            </w:r>
+            <w:r>
+              <w:rPr>
+                <w:sz w:val="24"/>
+                <w:szCs w:val="24"/>
+              </w:rPr>
+              <w:t xml:space="preserve"> of answer quality, token usage, cost, latency, and workflow complexity.</w:t>
+            </w:r>
           </w:p>
         </w:tc>
       </w:tr>
     </w:tbl>
-    <w:p/>
-    <w:p/>
-    <w:p/>
     <w:p/>
     <w:tbl>
       <w:tblPr>
@@ -1297,28 +1994,90 @@
                 <w:sz w:val="24"/>
                 <w:szCs w:val="24"/>
               </w:rPr>
-              <w:t>Response:</w:t>
-            </w:r>
-          </w:p>
-          <w:p>
-            <w:pPr>
-              <w:spacing w:after="120"/>
-              <w:rPr>
-                <w:sz w:val="24"/>
-                <w:szCs w:val="24"/>
-              </w:rPr>
-            </w:pPr>
+              <w:t xml:space="preserve">I selected these optimizations because the </w:t>
+            </w:r>
+            <w:r>
+              <w:rPr>
+                <w:sz w:val="24"/>
+                <w:szCs w:val="24"/>
+                <w:u w:val="single"/>
+              </w:rPr>
+              <w:t>Agentic workflow</w:t>
+            </w:r>
+            <w:r>
+              <w:rPr>
+                <w:sz w:val="24"/>
+                <w:szCs w:val="24"/>
+              </w:rPr>
+              <w:t xml:space="preserve"> can provide additional retrieval and reasoning for </w:t>
+            </w:r>
+            <w:r>
+              <w:rPr>
+                <w:sz w:val="24"/>
+                <w:szCs w:val="24"/>
+                <w:u w:val="single"/>
+              </w:rPr>
+              <w:t>difficult questions</w:t>
+            </w:r>
+            <w:r>
+              <w:rPr>
+                <w:sz w:val="24"/>
+                <w:szCs w:val="24"/>
+              </w:rPr>
+              <w:t xml:space="preserve">, but it requires substantially more model calls and tokens. The experiments also showed that a more expensive Agentic workflow is not always necessary when Context-Aware produces the same result. </w:t>
+            </w:r>
+            <w:proofErr w:type="gramStart"/>
+            <w:r>
+              <w:rPr>
+                <w:sz w:val="24"/>
+                <w:szCs w:val="24"/>
+              </w:rPr>
+              <w:t>This supports</w:t>
+            </w:r>
+            <w:proofErr w:type="gramEnd"/>
+            <w:r>
+              <w:rPr>
+                <w:sz w:val="24"/>
+                <w:szCs w:val="24"/>
+              </w:rPr>
+              <w:t xml:space="preserve"> selecting the </w:t>
+            </w:r>
+            <w:r>
+              <w:rPr>
+                <w:sz w:val="24"/>
+                <w:szCs w:val="24"/>
+                <w:u w:val="single"/>
+              </w:rPr>
+              <w:t>least complex workflow</w:t>
+            </w:r>
+            <w:r>
+              <w:rPr>
+                <w:sz w:val="24"/>
+                <w:szCs w:val="24"/>
+              </w:rPr>
+              <w:t xml:space="preserve"> that reliably solves the task.</w:t>
+            </w:r>
           </w:p>
         </w:tc>
       </w:tr>
     </w:tbl>
     <w:p/>
+    <w:p/>
+    <w:p/>
+    <w:p/>
+    <w:p/>
+    <w:p/>
+    <w:p/>
+    <w:p/>
+    <w:p/>
+    <w:p/>
     <w:p>
       <w:pPr>
         <w:pStyle w:val="Heading1"/>
         <w:spacing w:after="0"/>
       </w:pPr>
       <w:r>
+        <w:lastRenderedPageBreak/>
         <w:t xml:space="preserve">Step </w:t>
       </w:r>
       <w:r>
@@ -1463,17 +2222,116 @@
                 <w:sz w:val="24"/>
                 <w:szCs w:val="24"/>
               </w:rPr>
-              <w:t>Response:</w:t>
-            </w:r>
-          </w:p>
-          <w:p>
-            <w:pPr>
-              <w:spacing w:after="120"/>
-              <w:rPr>
-                <w:sz w:val="24"/>
-                <w:szCs w:val="24"/>
-              </w:rPr>
-            </w:pPr>
+              <w:t xml:space="preserve">Checkpoint 6.1 identified reliability and performance weaknesses that guided the improvements evaluated in Checkpoint 7.1. The earlier evaluation showed that </w:t>
+            </w:r>
+            <w:r>
+              <w:rPr>
+                <w:sz w:val="24"/>
+                <w:szCs w:val="24"/>
+                <w:u w:val="single"/>
+              </w:rPr>
+              <w:t>some configurations had difficulty handling potentially untrusted retrieved content</w:t>
+            </w:r>
+            <w:r>
+              <w:rPr>
+                <w:sz w:val="24"/>
+                <w:szCs w:val="24"/>
+              </w:rPr>
+              <w:t xml:space="preserve"> and that </w:t>
+            </w:r>
+            <w:r>
+              <w:rPr>
+                <w:sz w:val="24"/>
+                <w:szCs w:val="24"/>
+                <w:u w:val="single"/>
+              </w:rPr>
+              <w:t>Agentic processing required substantially more resources than the fixed Context-Aware workflow</w:t>
+            </w:r>
+            <w:r>
+              <w:rPr>
+                <w:sz w:val="24"/>
+                <w:szCs w:val="24"/>
+              </w:rPr>
+              <w:t xml:space="preserve">. In Checkpoint 7.1, the hardened workflow was evaluated against the </w:t>
+            </w:r>
+            <w:r>
+              <w:rPr>
+                <w:sz w:val="24"/>
+                <w:szCs w:val="24"/>
+                <w:u w:val="single"/>
+              </w:rPr>
+              <w:t>same five</w:t>
+            </w:r>
+            <w:r>
+              <w:rPr>
+                <w:sz w:val="24"/>
+                <w:szCs w:val="24"/>
+              </w:rPr>
+              <w:t xml:space="preserve"> diagnostic questions, while model and retrieval configurations were also compared. With GPT-5.4-mini and Hybrid retrieval, Context-Aware scored 4/5 using 6.3K tokens, $0.00149 estimated cost, and 8.86 seconds, while Agentic also scored 4/5 but used 32.6K tokens, $0.00749, and 26.15 seconds. In the cost experiment, Agentic scored 5/5 compared with 4/5 for Context-Aware, but required 40.4K tokens, $0.00915, and 29.63 seconds versus 9.1K tokens, $0.00202, and 9.65 seconds. </w:t>
+            </w:r>
+            <w:r>
+              <w:rPr>
+                <w:b/>
+                <w:bCs/>
+                <w:sz w:val="24"/>
+                <w:szCs w:val="24"/>
+              </w:rPr>
+              <w:t>The hardening results were mixed</w:t>
+            </w:r>
+            <w:r>
+              <w:rPr>
+                <w:sz w:val="24"/>
+                <w:szCs w:val="24"/>
+              </w:rPr>
+              <w:t xml:space="preserve">: </w:t>
+            </w:r>
+            <w:proofErr w:type="spellStart"/>
+            <w:r>
+              <w:rPr>
+                <w:sz w:val="24"/>
+                <w:szCs w:val="24"/>
+              </w:rPr>
+              <w:t>ReAct</w:t>
+            </w:r>
+            <w:proofErr w:type="spellEnd"/>
+            <w:r>
+              <w:rPr>
+                <w:sz w:val="24"/>
+                <w:szCs w:val="24"/>
+              </w:rPr>
+              <w:t xml:space="preserve"> Hybrid improved from 4/5 to 5/5, while the Lexical test decreased from 5/5 to 4/5 for Agentic and from 4/5 to 3/5 for Context-Aware. Overall, the results show that the </w:t>
+            </w:r>
+            <w:r>
+              <w:rPr>
+                <w:b/>
+                <w:bCs/>
+                <w:sz w:val="24"/>
+                <w:szCs w:val="24"/>
+              </w:rPr>
+              <w:t>improvements can help with some difficult tasks</w:t>
+            </w:r>
+            <w:r>
+              <w:rPr>
+                <w:sz w:val="24"/>
+                <w:szCs w:val="24"/>
+              </w:rPr>
+              <w:t xml:space="preserve">, but higher quality </w:t>
+            </w:r>
+            <w:r>
+              <w:rPr>
+                <w:sz w:val="24"/>
+                <w:szCs w:val="24"/>
+                <w:u w:val="single"/>
+              </w:rPr>
+              <w:t>can require additional resources</w:t>
+            </w:r>
+            <w:r>
+              <w:rPr>
+                <w:sz w:val="24"/>
+                <w:szCs w:val="24"/>
+              </w:rPr>
+              <w:t xml:space="preserve"> and improvements do not consistently transfer across configurations.</w:t>
+            </w:r>
           </w:p>
         </w:tc>
       </w:tr>
@@ -1553,7 +2411,54 @@
                 <w:sz w:val="24"/>
                 <w:szCs w:val="24"/>
               </w:rPr>
-              <w:t>Response:</w:t>
+              <w:t xml:space="preserve">The Checkpoint 7.1 optimization logs provide evidence from model-selection, workflow-comparison, and hardening experiments. The </w:t>
+            </w:r>
+            <w:proofErr w:type="spellStart"/>
+            <w:r>
+              <w:rPr>
+                <w:sz w:val="24"/>
+                <w:szCs w:val="24"/>
+              </w:rPr>
+              <w:t>ReAct</w:t>
+            </w:r>
+            <w:proofErr w:type="spellEnd"/>
+            <w:r>
+              <w:rPr>
+                <w:sz w:val="24"/>
+                <w:szCs w:val="24"/>
+              </w:rPr>
+              <w:t xml:space="preserve"> Hybrid hardened run passed 5/5 using 31.2K tokens, 32.32 seconds, and 16 workflow steps. The </w:t>
+            </w:r>
+            <w:proofErr w:type="spellStart"/>
+            <w:r>
+              <w:rPr>
+                <w:sz w:val="24"/>
+                <w:szCs w:val="24"/>
+              </w:rPr>
+              <w:t>ReAct</w:t>
+            </w:r>
+            <w:proofErr w:type="spellEnd"/>
+            <w:r>
+              <w:rPr>
+                <w:sz w:val="24"/>
+                <w:szCs w:val="24"/>
+              </w:rPr>
+              <w:t xml:space="preserve"> Hybrid + Graph hardened run passed 4/5 using 31K tokens and 29.47 seconds, with cross-document synthesis remaining a failure. The model-selection experiments showed GPT-5.4-mini achieving 5/5 in one Agentic Hybrid + Graph comparison while using 40.4K tokens and 29.63 seconds, compared with 4/5 for Context-Aware using 9.1K tokens and 9.65 seconds. These results demonstrate that </w:t>
+            </w:r>
+            <w:r>
+              <w:rPr>
+                <w:sz w:val="24"/>
+                <w:szCs w:val="24"/>
+                <w:u w:val="single"/>
+              </w:rPr>
+              <w:t>optimization is about selecting an appropriate configuration</w:t>
+            </w:r>
+            <w:r>
+              <w:rPr>
+                <w:sz w:val="24"/>
+                <w:szCs w:val="24"/>
+              </w:rPr>
+              <w:t xml:space="preserve"> rather than simply maximizing model or workflow complexity.</w:t>
             </w:r>
           </w:p>
           <w:p>
@@ -1574,12 +2479,15 @@
         <w:spacing w:after="0"/>
       </w:pPr>
     </w:p>
+    <w:p/>
+    <w:p/>
     <w:p>
       <w:pPr>
         <w:pStyle w:val="Heading1"/>
         <w:spacing w:after="0"/>
       </w:pPr>
       <w:r>
+        <w:lastRenderedPageBreak/>
         <w:t xml:space="preserve">Step </w:t>
       </w:r>
       <w:r>
@@ -1709,26 +2617,83 @@
                 <w:sz w:val="24"/>
                 <w:szCs w:val="24"/>
               </w:rPr>
-              <w:t>Response:</w:t>
-            </w:r>
-          </w:p>
-          <w:p>
-            <w:pPr>
-              <w:spacing w:after="120"/>
-              <w:rPr>
-                <w:sz w:val="24"/>
-                <w:szCs w:val="24"/>
-              </w:rPr>
-            </w:pPr>
-          </w:p>
-          <w:p>
-            <w:pPr>
-              <w:spacing w:after="120"/>
-              <w:rPr>
-                <w:sz w:val="24"/>
-                <w:szCs w:val="24"/>
-              </w:rPr>
-            </w:pPr>
+              <w:t xml:space="preserve">The main trade-off is </w:t>
+            </w:r>
+            <w:r>
+              <w:rPr>
+                <w:sz w:val="24"/>
+                <w:szCs w:val="24"/>
+                <w:u w:val="single"/>
+              </w:rPr>
+              <w:t>output quality versus cost and latency</w:t>
+            </w:r>
+            <w:r>
+              <w:rPr>
+                <w:sz w:val="24"/>
+                <w:szCs w:val="24"/>
+              </w:rPr>
+              <w:t xml:space="preserve">. Agentic processing can improve difficult questions, but it requires substantially more tokens, model calls, and execution time. A second trade-off is </w:t>
+            </w:r>
+            <w:r>
+              <w:rPr>
+                <w:sz w:val="24"/>
+                <w:szCs w:val="24"/>
+                <w:u w:val="single"/>
+              </w:rPr>
+              <w:t>flexibility versus predictability</w:t>
+            </w:r>
+            <w:r>
+              <w:rPr>
+                <w:sz w:val="24"/>
+                <w:szCs w:val="24"/>
+              </w:rPr>
+              <w:t xml:space="preserve">: Context-Aware uses a fixed workflow with lower and more predictable resource usage, while Agentic can perform additional retrieval and reasoning but has greater execution depth. A third trade-off is </w:t>
+            </w:r>
+            <w:r>
+              <w:rPr>
+                <w:sz w:val="24"/>
+                <w:szCs w:val="24"/>
+                <w:u w:val="single"/>
+              </w:rPr>
+              <w:t>reliability versus complexity</w:t>
+            </w:r>
+            <w:r>
+              <w:rPr>
+                <w:sz w:val="24"/>
+                <w:szCs w:val="24"/>
+              </w:rPr>
+              <w:t xml:space="preserve">: additional verification can improve some failure cases, but the hardening results were not consistently better across every configuration. </w:t>
+            </w:r>
+            <w:r>
+              <w:rPr>
+                <w:sz w:val="24"/>
+                <w:szCs w:val="24"/>
+                <w:u w:val="single"/>
+              </w:rPr>
+              <w:t>These results support using</w:t>
+            </w:r>
+            <w:r>
+              <w:rPr>
+                <w:sz w:val="24"/>
+                <w:szCs w:val="24"/>
+              </w:rPr>
+              <w:t xml:space="preserve"> </w:t>
+            </w:r>
+            <w:r>
+              <w:rPr>
+                <w:sz w:val="24"/>
+                <w:szCs w:val="24"/>
+                <w:u w:val="single"/>
+              </w:rPr>
+              <w:t>Context-Aware for simpler questions and reserving Agentic processing for questions that require additional reasoning or retrieval</w:t>
+            </w:r>
+            <w:r>
+              <w:rPr>
+                <w:sz w:val="24"/>
+                <w:szCs w:val="24"/>
+              </w:rPr>
+              <w:t>.</w:t>
+            </w:r>
           </w:p>
         </w:tc>
       </w:tr>
@@ -1737,19 +2702,24 @@
     <w:p/>
     <w:p/>
     <w:p/>
+    <w:p/>
+    <w:p/>
+    <w:p/>
+    <w:p/>
+    <w:p/>
+    <w:p/>
+    <w:p/>
+    <w:p/>
+    <w:p/>
+    <w:p/>
     <w:p>
       <w:pPr>
         <w:pStyle w:val="Heading1"/>
         <w:spacing w:after="0"/>
       </w:pPr>
       <w:r>
-        <w:t xml:space="preserve">Step </w:t>
-      </w:r>
-      <w:r>
-        <w:t>6</w:t>
-      </w:r>
-      <w:r>
-        <w:t xml:space="preserve">. </w:t>
+        <w:lastRenderedPageBreak/>
+        <w:t xml:space="preserve">Step 6. </w:t>
       </w:r>
       <w:r>
         <w:t>Reflection and Next Steps</w:t>
@@ -1800,27 +2770,7 @@
           <w:sz w:val="24"/>
           <w:szCs w:val="24"/>
         </w:rPr>
-        <w:t xml:space="preserve">Identify remaining limitations and describe what you </w:t>
-      </w:r>
-      <w:proofErr w:type="gramStart"/>
-      <w:r>
-        <w:rPr>
-          <w:rFonts w:eastAsia="Aptos"/>
-          <w:color w:val="000000"/>
-          <w:sz w:val="24"/>
-          <w:szCs w:val="24"/>
-        </w:rPr>
-        <w:t>would</w:t>
-      </w:r>
-      <w:proofErr w:type="gramEnd"/>
-      <w:r>
-        <w:rPr>
-          <w:rFonts w:eastAsia="Aptos"/>
-          <w:color w:val="000000"/>
-          <w:sz w:val="24"/>
-          <w:szCs w:val="24"/>
-        </w:rPr>
-        <w:t xml:space="preserve"> improve next.</w:t>
+        <w:t>Identify remaining limitations and describe what you would improve next.</w:t>
       </w:r>
     </w:p>
     <w:tbl>
@@ -1894,17 +2844,62 @@
                 <w:sz w:val="24"/>
                 <w:szCs w:val="24"/>
               </w:rPr>
-              <w:t>Response:</w:t>
-            </w:r>
-          </w:p>
-          <w:p>
-            <w:pPr>
-              <w:spacing w:after="120"/>
-              <w:rPr>
-                <w:sz w:val="24"/>
-                <w:szCs w:val="24"/>
-              </w:rPr>
-            </w:pPr>
+              <w:t xml:space="preserve">The improvements were partially effective. Checkpoint 6.1 identified </w:t>
+            </w:r>
+            <w:r>
+              <w:rPr>
+                <w:sz w:val="24"/>
+                <w:szCs w:val="24"/>
+                <w:u w:val="single"/>
+              </w:rPr>
+              <w:t>reliability weaknesses in evidence handling</w:t>
+            </w:r>
+            <w:r>
+              <w:rPr>
+                <w:sz w:val="24"/>
+                <w:szCs w:val="24"/>
+              </w:rPr>
+              <w:t xml:space="preserve"> and showed that Agentic processing could improve difficult tasks but required substantially more tokens and model steps than the Context-Aware workflow. These findings guided the Checkpoint 7.1 hardening and optimization efforts. In 7.1, GPT-5.4-mini produced strong Agentic results with lower token usage and latency than GPT-4o-mini in several experiments, while Context-Aware remained substantially more efficient for simpler tasks. </w:t>
+            </w:r>
+            <w:r>
+              <w:rPr>
+                <w:sz w:val="24"/>
+                <w:szCs w:val="24"/>
+                <w:u w:val="single"/>
+              </w:rPr>
+              <w:t>The hardening results were mixed</w:t>
+            </w:r>
+            <w:r>
+              <w:rPr>
+                <w:sz w:val="24"/>
+                <w:szCs w:val="24"/>
+              </w:rPr>
+              <w:t xml:space="preserve">: </w:t>
+            </w:r>
+            <w:proofErr w:type="spellStart"/>
+            <w:r>
+              <w:rPr>
+                <w:sz w:val="24"/>
+                <w:szCs w:val="24"/>
+              </w:rPr>
+              <w:t>ReAct</w:t>
+            </w:r>
+            <w:proofErr w:type="spellEnd"/>
+            <w:r>
+              <w:rPr>
+                <w:sz w:val="24"/>
+                <w:szCs w:val="24"/>
+              </w:rPr>
+              <w:t xml:space="preserve"> Hybrid improved from 4/5 to 5/5, but the October 6 Lexical test decreased from 5/5 to 4/5 for Agentic and from 4/5 to 3/5 for Context-Aware. Overall, the </w:t>
+            </w:r>
+            <w:r>
+              <w:rPr>
+                <w:sz w:val="24"/>
+                <w:szCs w:val="24"/>
+                <w:u w:val="single"/>
+              </w:rPr>
+              <w:t>improvements addressed some of the weaknesses identified in 6.1, but the results show that no single configuration consistently maximized reliability, quality, cost, and latency.</w:t>
+            </w:r>
           </w:p>
         </w:tc>
       </w:tr>
@@ -1990,21 +2985,157 @@
                 <w:sz w:val="24"/>
                 <w:szCs w:val="24"/>
               </w:rPr>
-              <w:t>Response:</w:t>
-            </w:r>
-          </w:p>
-          <w:p>
-            <w:pPr>
-              <w:spacing w:after="120"/>
-              <w:rPr>
-                <w:sz w:val="24"/>
-                <w:szCs w:val="24"/>
-              </w:rPr>
-            </w:pPr>
+              <w:t xml:space="preserve">Several limitations remain. Cross-document synthesis continues to be a </w:t>
+            </w:r>
+            <w:r>
+              <w:rPr>
+                <w:sz w:val="24"/>
+                <w:szCs w:val="24"/>
+                <w:u w:val="single"/>
+              </w:rPr>
+              <w:t>recurring weakness</w:t>
+            </w:r>
+            <w:r>
+              <w:rPr>
+                <w:sz w:val="24"/>
+                <w:szCs w:val="24"/>
+              </w:rPr>
+              <w:t xml:space="preserve">, particularly in some Semantic and Hybrid + Graph configurations, which was also identified in earlier evaluations. The 7.1 hardening results show that improving one configuration does not necessarily improve all retrieval strategies and may sometimes </w:t>
+            </w:r>
+            <w:r>
+              <w:rPr>
+                <w:sz w:val="24"/>
+                <w:szCs w:val="24"/>
+                <w:u w:val="single"/>
+              </w:rPr>
+              <w:t>reduce performance</w:t>
+            </w:r>
+            <w:r>
+              <w:rPr>
+                <w:sz w:val="24"/>
+                <w:szCs w:val="24"/>
+              </w:rPr>
+              <w:t xml:space="preserve">. The diagnostic test set contains </w:t>
+            </w:r>
+            <w:r>
+              <w:rPr>
+                <w:sz w:val="24"/>
+                <w:szCs w:val="24"/>
+                <w:u w:val="single"/>
+              </w:rPr>
+              <w:t>only five questions</w:t>
+            </w:r>
+            <w:r>
+              <w:rPr>
+                <w:sz w:val="24"/>
+                <w:szCs w:val="24"/>
+              </w:rPr>
+              <w:t xml:space="preserve">, so it is useful for identifying specific failure modes but is </w:t>
+            </w:r>
+            <w:r>
+              <w:rPr>
+                <w:sz w:val="24"/>
+                <w:szCs w:val="24"/>
+                <w:u w:val="single"/>
+              </w:rPr>
+              <w:t>not large enough</w:t>
+            </w:r>
+            <w:r>
+              <w:rPr>
+                <w:sz w:val="24"/>
+                <w:szCs w:val="24"/>
+              </w:rPr>
+              <w:t xml:space="preserve"> to establish broad production reliability. In addition, </w:t>
+            </w:r>
+            <w:r>
+              <w:rPr>
+                <w:sz w:val="24"/>
+                <w:szCs w:val="24"/>
+                <w:u w:val="single"/>
+              </w:rPr>
+              <w:t>query-based routing</w:t>
+            </w:r>
+            <w:r>
+              <w:rPr>
+                <w:sz w:val="24"/>
+                <w:szCs w:val="24"/>
+              </w:rPr>
+              <w:t xml:space="preserve"> has not yet been validated on a larger and more representative workload, so the system still needs further testing to determine when Context-Aware or Agentic processing should be selected.</w:t>
+            </w:r>
           </w:p>
         </w:tc>
       </w:tr>
     </w:tbl>
+    <w:p>
+      <w:pPr>
+        <w:rPr>
+          <w:rFonts w:eastAsia="Aptos"/>
+          <w:color w:val="000000"/>
+          <w:sz w:val="24"/>
+          <w:szCs w:val="24"/>
+        </w:rPr>
+      </w:pPr>
+    </w:p>
+    <w:p>
+      <w:pPr>
+        <w:rPr>
+          <w:rFonts w:eastAsia="Aptos"/>
+          <w:color w:val="000000"/>
+          <w:sz w:val="24"/>
+          <w:szCs w:val="24"/>
+        </w:rPr>
+      </w:pPr>
+    </w:p>
+    <w:p>
+      <w:pPr>
+        <w:rPr>
+          <w:rFonts w:eastAsia="Aptos"/>
+          <w:color w:val="000000"/>
+          <w:sz w:val="24"/>
+          <w:szCs w:val="24"/>
+        </w:rPr>
+      </w:pPr>
+    </w:p>
+    <w:p>
+      <w:pPr>
+        <w:rPr>
+          <w:rFonts w:eastAsia="Aptos"/>
+          <w:color w:val="000000"/>
+          <w:sz w:val="24"/>
+          <w:szCs w:val="24"/>
+        </w:rPr>
+      </w:pPr>
+    </w:p>
+    <w:p>
+      <w:pPr>
+        <w:rPr>
+          <w:rFonts w:eastAsia="Aptos"/>
+          <w:color w:val="000000"/>
+          <w:sz w:val="24"/>
+          <w:szCs w:val="24"/>
+        </w:rPr>
+      </w:pPr>
+    </w:p>
+    <w:p>
+      <w:pPr>
+        <w:rPr>
+          <w:rFonts w:eastAsia="Aptos"/>
+          <w:color w:val="000000"/>
+          <w:sz w:val="24"/>
+          <w:szCs w:val="24"/>
+        </w:rPr>
+      </w:pPr>
+    </w:p>
+    <w:p>
+      <w:pPr>
+        <w:rPr>
+          <w:rFonts w:eastAsia="Aptos"/>
+          <w:color w:val="000000"/>
+          <w:sz w:val="24"/>
+          <w:szCs w:val="24"/>
+        </w:rPr>
+      </w:pPr>
+    </w:p>
     <w:p>
       <w:pPr>
         <w:rPr>
@@ -2086,17 +3217,148 @@
                 <w:sz w:val="24"/>
                 <w:szCs w:val="24"/>
               </w:rPr>
-              <w:t>Response:</w:t>
-            </w:r>
-          </w:p>
-          <w:p>
-            <w:pPr>
-              <w:spacing w:after="120"/>
-              <w:rPr>
-                <w:sz w:val="24"/>
-                <w:szCs w:val="24"/>
-              </w:rPr>
-            </w:pPr>
+              <w:t xml:space="preserve">The next improvement would be to implement and evaluate </w:t>
+            </w:r>
+            <w:r>
+              <w:rPr>
+                <w:sz w:val="24"/>
+                <w:szCs w:val="24"/>
+                <w:u w:val="single"/>
+              </w:rPr>
+              <w:t>query-based routing</w:t>
+            </w:r>
+            <w:r>
+              <w:rPr>
+                <w:sz w:val="24"/>
+                <w:szCs w:val="24"/>
+              </w:rPr>
+              <w:t xml:space="preserve"> based on the </w:t>
+            </w:r>
+            <w:r>
+              <w:rPr>
+                <w:sz w:val="24"/>
+                <w:szCs w:val="24"/>
+              </w:rPr>
+              <w:t xml:space="preserve">complexity </w:t>
+            </w:r>
+            <w:r>
+              <w:rPr>
+                <w:sz w:val="24"/>
+                <w:szCs w:val="24"/>
+              </w:rPr>
+              <w:t xml:space="preserve">of each question. </w:t>
+            </w:r>
+            <w:r>
+              <w:rPr>
+                <w:sz w:val="24"/>
+                <w:szCs w:val="24"/>
+                <w:u w:val="single"/>
+              </w:rPr>
+              <w:t>Simple factual questions</w:t>
+            </w:r>
+            <w:r>
+              <w:rPr>
+                <w:sz w:val="24"/>
+                <w:szCs w:val="24"/>
+              </w:rPr>
+              <w:t xml:space="preserve"> could </w:t>
+            </w:r>
+            <w:r>
+              <w:rPr>
+                <w:sz w:val="24"/>
+                <w:szCs w:val="24"/>
+                <w:u w:val="single"/>
+              </w:rPr>
+              <w:t>use the Context-Aware</w:t>
+            </w:r>
+            <w:r>
+              <w:rPr>
+                <w:sz w:val="24"/>
+                <w:szCs w:val="24"/>
+              </w:rPr>
+              <w:t xml:space="preserve"> workflow because it provides lower cost, lower latency, and more predictable execution, while questions requiring </w:t>
+            </w:r>
+            <w:r>
+              <w:rPr>
+                <w:sz w:val="24"/>
+                <w:szCs w:val="24"/>
+                <w:u w:val="single"/>
+              </w:rPr>
+              <w:t>cross-document synthesis</w:t>
+            </w:r>
+            <w:r>
+              <w:rPr>
+                <w:sz w:val="24"/>
+                <w:szCs w:val="24"/>
+              </w:rPr>
+              <w:t xml:space="preserve">, additional retrieval, or more complex reasoning could be routed to the </w:t>
+            </w:r>
+            <w:r>
+              <w:rPr>
+                <w:sz w:val="24"/>
+                <w:szCs w:val="24"/>
+                <w:u w:val="single"/>
+              </w:rPr>
+              <w:t>Agentic workflow</w:t>
+            </w:r>
+            <w:r>
+              <w:rPr>
+                <w:sz w:val="24"/>
+                <w:szCs w:val="24"/>
+              </w:rPr>
+              <w:t xml:space="preserve">. I would also </w:t>
+            </w:r>
+            <w:r>
+              <w:rPr>
+                <w:sz w:val="24"/>
+                <w:szCs w:val="24"/>
+              </w:rPr>
+              <w:t xml:space="preserve">like to </w:t>
+            </w:r>
+            <w:r>
+              <w:rPr>
+                <w:sz w:val="24"/>
+                <w:szCs w:val="24"/>
+              </w:rPr>
+              <w:t>expand the evaluation set b</w:t>
+            </w:r>
+            <w:r>
+              <w:rPr>
+                <w:sz w:val="24"/>
+                <w:szCs w:val="24"/>
+                <w:u w:val="single"/>
+              </w:rPr>
+              <w:t>eyond the current five diagnostic questions</w:t>
+            </w:r>
+            <w:r>
+              <w:rPr>
+                <w:sz w:val="24"/>
+                <w:szCs w:val="24"/>
+              </w:rPr>
+              <w:t xml:space="preserve">, with additional cross-document, quotation, corpus-poisoning, and out-of-corpus tests. Finally, I would </w:t>
+            </w:r>
+            <w:r>
+              <w:rPr>
+                <w:sz w:val="24"/>
+                <w:szCs w:val="24"/>
+              </w:rPr>
+              <w:t xml:space="preserve">also like to </w:t>
+            </w:r>
+            <w:r>
+              <w:rPr>
+                <w:sz w:val="24"/>
+                <w:szCs w:val="24"/>
+              </w:rPr>
+              <w:t xml:space="preserve">continuously monitor answer quality, cost, latency, and failure categories </w:t>
+            </w:r>
+            <w:r>
+              <w:rPr>
+                <w:sz w:val="24"/>
+                <w:szCs w:val="24"/>
+                <w:u w:val="single"/>
+              </w:rPr>
+              <w:t>to determine whether the routing strategy improves overall system performance and reliability before production deployment.</w:t>
+            </w:r>
           </w:p>
         </w:tc>
       </w:tr>
@@ -2113,9 +3375,170 @@
     </w:p>
     <w:p>
       <w:pPr>
+        <w:rPr>
+          <w:rFonts w:eastAsia="Aptos"/>
+          <w:color w:val="000000"/>
+          <w:sz w:val="24"/>
+          <w:szCs w:val="24"/>
+        </w:rPr>
+      </w:pPr>
+    </w:p>
+    <w:p>
+      <w:pPr>
+        <w:rPr>
+          <w:rFonts w:eastAsia="Aptos"/>
+          <w:color w:val="000000"/>
+          <w:sz w:val="24"/>
+          <w:szCs w:val="24"/>
+        </w:rPr>
+      </w:pPr>
+    </w:p>
+    <w:p>
+      <w:pPr>
+        <w:rPr>
+          <w:rFonts w:eastAsia="Aptos"/>
+          <w:color w:val="000000"/>
+          <w:sz w:val="24"/>
+          <w:szCs w:val="24"/>
+        </w:rPr>
+      </w:pPr>
+    </w:p>
+    <w:p>
+      <w:pPr>
+        <w:rPr>
+          <w:rFonts w:eastAsia="Aptos"/>
+          <w:color w:val="000000"/>
+          <w:sz w:val="24"/>
+          <w:szCs w:val="24"/>
+        </w:rPr>
+      </w:pPr>
+    </w:p>
+    <w:p>
+      <w:pPr>
+        <w:rPr>
+          <w:rFonts w:eastAsia="Aptos"/>
+          <w:color w:val="000000"/>
+          <w:sz w:val="24"/>
+          <w:szCs w:val="24"/>
+        </w:rPr>
+      </w:pPr>
+    </w:p>
+    <w:p>
+      <w:pPr>
+        <w:rPr>
+          <w:rFonts w:eastAsia="Aptos"/>
+          <w:color w:val="000000"/>
+          <w:sz w:val="24"/>
+          <w:szCs w:val="24"/>
+        </w:rPr>
+      </w:pPr>
+    </w:p>
+    <w:p>
+      <w:pPr>
+        <w:rPr>
+          <w:rFonts w:eastAsia="Aptos"/>
+          <w:color w:val="000000"/>
+          <w:sz w:val="24"/>
+          <w:szCs w:val="24"/>
+        </w:rPr>
+      </w:pPr>
+    </w:p>
+    <w:p>
+      <w:pPr>
+        <w:rPr>
+          <w:rFonts w:eastAsia="Aptos"/>
+          <w:color w:val="000000"/>
+          <w:sz w:val="24"/>
+          <w:szCs w:val="24"/>
+        </w:rPr>
+      </w:pPr>
+    </w:p>
+    <w:p>
+      <w:pPr>
+        <w:rPr>
+          <w:rFonts w:eastAsia="Aptos"/>
+          <w:color w:val="000000"/>
+          <w:sz w:val="24"/>
+          <w:szCs w:val="24"/>
+        </w:rPr>
+      </w:pPr>
+    </w:p>
+    <w:p>
+      <w:pPr>
+        <w:rPr>
+          <w:rFonts w:eastAsia="Aptos"/>
+          <w:color w:val="000000"/>
+          <w:sz w:val="24"/>
+          <w:szCs w:val="24"/>
+        </w:rPr>
+      </w:pPr>
+    </w:p>
+    <w:p>
+      <w:pPr>
+        <w:rPr>
+          <w:rFonts w:eastAsia="Aptos"/>
+          <w:color w:val="000000"/>
+          <w:sz w:val="24"/>
+          <w:szCs w:val="24"/>
+        </w:rPr>
+      </w:pPr>
+    </w:p>
+    <w:p>
+      <w:pPr>
+        <w:rPr>
+          <w:rFonts w:eastAsia="Aptos"/>
+          <w:color w:val="000000"/>
+          <w:sz w:val="24"/>
+          <w:szCs w:val="24"/>
+        </w:rPr>
+      </w:pPr>
+    </w:p>
+    <w:p>
+      <w:pPr>
+        <w:rPr>
+          <w:rFonts w:eastAsia="Aptos"/>
+          <w:color w:val="000000"/>
+          <w:sz w:val="24"/>
+          <w:szCs w:val="24"/>
+        </w:rPr>
+      </w:pPr>
+    </w:p>
+    <w:p>
+      <w:pPr>
+        <w:rPr>
+          <w:rFonts w:eastAsia="Aptos"/>
+          <w:color w:val="000000"/>
+          <w:sz w:val="24"/>
+          <w:szCs w:val="24"/>
+        </w:rPr>
+      </w:pPr>
+    </w:p>
+    <w:p>
+      <w:pPr>
+        <w:rPr>
+          <w:rFonts w:eastAsia="Aptos"/>
+          <w:color w:val="000000"/>
+          <w:sz w:val="24"/>
+          <w:szCs w:val="24"/>
+        </w:rPr>
+      </w:pPr>
+    </w:p>
+    <w:p>
+      <w:pPr>
+        <w:rPr>
+          <w:rFonts w:eastAsia="Aptos"/>
+          <w:color w:val="000000"/>
+          <w:sz w:val="24"/>
+          <w:szCs w:val="24"/>
+        </w:rPr>
+      </w:pPr>
+    </w:p>
+    <w:p>
+      <w:pPr>
         <w:pStyle w:val="Heading1"/>
       </w:pPr>
       <w:r>
+        <w:lastRenderedPageBreak/>
         <w:t>Supporting Materials</w:t>
       </w:r>
     </w:p>
@@ -2262,6 +3685,48 @@
                 <w:szCs w:val="24"/>
               </w:rPr>
             </w:pPr>
+            <w:proofErr w:type="spellStart"/>
+            <w:r>
+              <w:rPr>
+                <w:sz w:val="24"/>
+                <w:szCs w:val="24"/>
+              </w:rPr>
+              <w:t>Test_Questions_Manually_Failure.json</w:t>
+            </w:r>
+            <w:proofErr w:type="spellEnd"/>
+            <w:r>
+              <w:rPr>
+                <w:sz w:val="24"/>
+                <w:szCs w:val="24"/>
+              </w:rPr>
+              <w:t xml:space="preserve"> — five Checkpoint 7.1 diagnostic questions covering cross-document synthesis, corpus-poisoning/factual retrieval, out-of-corpus abstention, and quotation fidelity.</w:t>
+            </w:r>
+          </w:p>
+          <w:p>
+            <w:pPr>
+              <w:rPr>
+                <w:sz w:val="24"/>
+                <w:szCs w:val="24"/>
+              </w:rPr>
+            </w:pPr>
+            <w:hyperlink r:id="rId8" w:history="1">
+              <w:r>
+                <w:rPr>
+                  <w:rStyle w:val="Hyperlink"/>
+                  <w:sz w:val="24"/>
+                  <w:szCs w:val="24"/>
+                </w:rPr>
+                <w:t>https://github.com/miguelangelherrera77-blip/MIT_CAPSTONE</w:t>
+              </w:r>
+            </w:hyperlink>
+          </w:p>
+          <w:p>
+            <w:pPr>
+              <w:rPr>
+                <w:sz w:val="24"/>
+                <w:szCs w:val="24"/>
+              </w:rPr>
+            </w:pPr>
           </w:p>
         </w:tc>
       </w:tr>
@@ -2290,14 +3755,7 @@
                 <w:rFonts w:ascii="Aptos" w:hAnsi="Aptos"/>
                 <w:color w:val="000000"/>
               </w:rPr>
-              <w:t>Performance measurements</w:t>
-            </w:r>
-            <w:r>
-              <w:rPr>
-                <w:rFonts w:ascii="Aptos" w:hAnsi="Aptos"/>
-                <w:color w:val="000000"/>
-              </w:rPr>
-              <w:t xml:space="preserve"> </w:t>
+              <w:t xml:space="preserve">Performance measurements </w:t>
             </w:r>
           </w:p>
           <w:p>
@@ -2321,6 +3779,53 @@
               <w:right w:val="single" w:sz="6" w:space="0" w:color="BFBFBF"/>
             </w:tcBorders>
           </w:tcPr>
+          <w:p>
+            <w:pPr>
+              <w:rPr>
+                <w:sz w:val="24"/>
+                <w:szCs w:val="24"/>
+              </w:rPr>
+            </w:pPr>
+            <w:r>
+              <w:rPr>
+                <w:sz w:val="24"/>
+                <w:szCs w:val="24"/>
+              </w:rPr>
+              <w:t>checkpoint_7_1_optimization_performanc</w:t>
+            </w:r>
+            <w:r>
+              <w:rPr>
+                <w:sz w:val="24"/>
+                <w:szCs w:val="24"/>
+              </w:rPr>
+              <w:t>e</w:t>
+            </w:r>
+            <w:r>
+              <w:rPr>
+                <w:sz w:val="24"/>
+                <w:szCs w:val="24"/>
+              </w:rPr>
+              <w:t>.log — pass rate, tokens, estimated cost, latency, model calls, and workflow steps.</w:t>
+            </w:r>
+          </w:p>
+          <w:p>
+            <w:pPr>
+              <w:rPr>
+                <w:sz w:val="24"/>
+                <w:szCs w:val="24"/>
+              </w:rPr>
+            </w:pPr>
+            <w:hyperlink r:id="rId9" w:history="1">
+              <w:r>
+                <w:rPr>
+                  <w:rStyle w:val="Hyperlink"/>
+                  <w:sz w:val="24"/>
+                  <w:szCs w:val="24"/>
+                </w:rPr>
+                <w:t>https://github.com/miguelangelherrera77-blip/MIT_CAPSTONE</w:t>
+              </w:r>
+            </w:hyperlink>
+          </w:p>
           <w:p>
             <w:pPr>
               <w:rPr>
@@ -2373,6 +3878,13 @@
                 <w:szCs w:val="24"/>
               </w:rPr>
             </w:pPr>
+            <w:r>
+              <w:rPr>
+                <w:sz w:val="24"/>
+                <w:szCs w:val="24"/>
+              </w:rPr>
+              <w:t>Diagnostic examples include the Einstein corpus-poisoning question, the Mars population out-of-corpus question, the Einstein Nobel claim verification question, and the exact Nobel Prize quotation question.</w:t>
+            </w:r>
           </w:p>
           <w:p>
             <w:pPr>
@@ -2381,6 +3893,16 @@
                 <w:szCs w:val="24"/>
               </w:rPr>
             </w:pPr>
+            <w:hyperlink r:id="rId10" w:history="1">
+              <w:r>
+                <w:rPr>
+                  <w:rStyle w:val="Hyperlink"/>
+                  <w:sz w:val="24"/>
+                  <w:szCs w:val="24"/>
+                </w:rPr>
+                <w:t>https://github.com/miguelangelherrera77-blip/MIT_CAPSTONE</w:t>
+              </w:r>
+            </w:hyperlink>
           </w:p>
           <w:p>
             <w:pPr>
@@ -2417,7 +3939,6 @@
                 <w:rFonts w:ascii="Aptos" w:hAnsi="Aptos"/>
                 <w:color w:val="000000"/>
               </w:rPr>
-              <w:lastRenderedPageBreak/>
               <w:t xml:space="preserve">Screenshots or </w:t>
             </w:r>
             <w:r>
@@ -2452,6 +3973,30 @@
                 <w:szCs w:val="24"/>
               </w:rPr>
             </w:pPr>
+            <w:r>
+              <w:rPr>
+                <w:sz w:val="24"/>
+                <w:szCs w:val="24"/>
+              </w:rPr>
+              <w:t>GitHub logs:</w:t>
+            </w:r>
+            <w:r>
+              <w:rPr>
+                <w:sz w:val="24"/>
+                <w:szCs w:val="24"/>
+              </w:rPr>
+              <w:br/>
+            </w:r>
+            <w:hyperlink r:id="rId11" w:history="1">
+              <w:r>
+                <w:rPr>
+                  <w:rStyle w:val="Hyperlink"/>
+                  <w:sz w:val="24"/>
+                  <w:szCs w:val="24"/>
+                </w:rPr>
+                <w:t>https://github.com/miguelangelherrera77-blip/MIT_CAPSTONE</w:t>
+              </w:r>
+            </w:hyperlink>
           </w:p>
         </w:tc>
       </w:tr>
@@ -2504,6 +4049,40 @@
               <w:right w:val="single" w:sz="6" w:space="0" w:color="BFBFBF"/>
             </w:tcBorders>
           </w:tcPr>
+          <w:p>
+            <w:pPr>
+              <w:rPr>
+                <w:sz w:val="24"/>
+                <w:szCs w:val="24"/>
+              </w:rPr>
+            </w:pPr>
+            <w:hyperlink r:id="rId12" w:history="1">
+              <w:r>
+                <w:rPr>
+                  <w:rStyle w:val="Hyperlink"/>
+                  <w:sz w:val="24"/>
+                  <w:szCs w:val="24"/>
+                </w:rPr>
+                <w:t>https://github.com/mig</w:t>
+              </w:r>
+              <w:r>
+                <w:rPr>
+                  <w:rStyle w:val="Hyperlink"/>
+                  <w:sz w:val="24"/>
+                  <w:szCs w:val="24"/>
+                </w:rPr>
+                <w:t>u</w:t>
+              </w:r>
+              <w:r>
+                <w:rPr>
+                  <w:rStyle w:val="Hyperlink"/>
+                  <w:sz w:val="24"/>
+                  <w:szCs w:val="24"/>
+                </w:rPr>
+                <w:t>elangelherrera77-blip/MIT_CAPSTONE</w:t>
+              </w:r>
+            </w:hyperlink>
+          </w:p>
           <w:p>
             <w:pPr>
               <w:rPr>
@@ -2570,6 +4149,31 @@
                 <w:szCs w:val="24"/>
               </w:rPr>
             </w:pPr>
+            <w:r>
+              <w:rPr>
+                <w:sz w:val="24"/>
+                <w:szCs w:val="24"/>
+              </w:rPr>
+              <w:t>Checkpoint 5.1 and 6.1 evaluation results provide the baseline for the Agentic-vs-fixed workflow trade-off and the security/reliability issues addressed in Checkpoint 7.1.</w:t>
+            </w:r>
+          </w:p>
+          <w:p>
+            <w:pPr>
+              <w:rPr>
+                <w:sz w:val="24"/>
+                <w:szCs w:val="24"/>
+              </w:rPr>
+            </w:pPr>
+            <w:hyperlink r:id="rId13" w:history="1">
+              <w:r>
+                <w:rPr>
+                  <w:rStyle w:val="Hyperlink"/>
+                  <w:sz w:val="24"/>
+                  <w:szCs w:val="24"/>
+                </w:rPr>
+                <w:t>https://github.com/miguelangelherrera77-blip/MIT_CAPSTONE</w:t>
+              </w:r>
+            </w:hyperlink>
           </w:p>
         </w:tc>
       </w:tr>
@@ -2607,10 +4211,10 @@
       </w:r>
     </w:p>
     <w:sectPr>
-      <w:headerReference w:type="even" r:id="rId8"/>
-      <w:headerReference w:type="default" r:id="rId9"/>
-      <w:footerReference w:type="default" r:id="rId10"/>
-      <w:headerReference w:type="first" r:id="rId11"/>
+      <w:headerReference w:type="even" r:id="rId14"/>
+      <w:headerReference w:type="default" r:id="rId15"/>
+      <w:footerReference w:type="default" r:id="rId16"/>
+      <w:headerReference w:type="first" r:id="rId17"/>
       <w:pgSz w:w="12240" w:h="15840"/>
       <w:pgMar w:top="1440" w:right="567" w:bottom="1440" w:left="567" w:header="57" w:footer="170" w:gutter="0"/>
       <w:pgNumType w:start="1"/>
@@ -2621,7 +4225,7 @@
 </file>
 
 <file path=word/endnotes.xml><?xml version="1.0" encoding="utf-8"?>
-<w:endnotes xmlns:wpc="http://schemas.microsoft.com/office/word/2010/wordprocessingCanvas" xmlns:cx="http://schemas.microsoft.com/office/drawing/2014/chartex" xmlns:cx1="http://schemas.microsoft.com/office/drawing/2015/9/8/chartex" xmlns:cx2="http://schemas.microsoft.com/office/drawing/2015/10/21/chartex" xmlns:cx3="http://schemas.microsoft.com/office/drawing/2016/5/9/chartex" xmlns:cx4="http://schemas.microsoft.com/office/drawing/2016/5/10/chartex" xmlns:cx5="http://schemas.microsoft.com/office/drawing/2016/5/11/chartex" xmlns:cx6="http://schemas.microsoft.com/office/drawing/2016/5/12/chartex" xmlns:cx7="http://schemas.microsoft.com/office/drawing/2016/5/13/chartex" xmlns:cx8="http://schemas.microsoft.com/office/drawing/2016/5/14/chartex" xmlns:mc="http://schemas.openxmlformats.org/markup-compatibility/2006" xmlns:aink="http://schemas.microsoft.com/office/drawing/2016/ink" xmlns:am3d="http://schemas.microsoft.com/office/drawing/2017/model3d" xmlns:o="urn:schemas-microsoft-com:office:office" xmlns:oel="http://schemas.microsoft.com/office/2019/extlst" xmlns:r="http://schemas.openxmlformats.org/officeDocument/2006/relationships" xmlns:m="http://schemas.openxmlformats.org/officeDocument/2006/math" xmlns:v="urn:schemas-microsoft-com:vml" xmlns:wp14="http://schemas.microsoft.com/office/word/2010/wordprocessingDrawing" xmlns:wp="http://schemas.openxmlformats.org/drawingml/2006/wordprocessingDrawing" xmlns:w10="urn:schemas-microsoft-com:office:word" xmlns:w="http://schemas.openxmlformats.org/wordprocessingml/2006/main" xmlns:w14="http://schemas.microsoft.com/office/word/2010/wordml" xmlns:w15="http://schemas.microsoft.com/office/word/2012/wordml" xmlns:w16cei="http://schemas.microsoft.com/office/word/2026/wordml/cei" xmlns:w16cex="http://schemas.microsoft.com/office/word/2018/wordml/cex" xmlns:w16cid="http://schemas.microsoft.com/office/word/2016/wordml/cid" xmlns:w16="http://schemas.microsoft.com/office/word/2018/wordml" xmlns:w16du="http://schemas.microsoft.com/office/word/2023/wordml/word16du" xmlns:w16sdtdh="http://schemas.microsoft.com/office/word/2020/wordml/sdtdatahash" xmlns:w16sdtfl="http://schemas.microsoft.com/office/word/2024/wordml/sdtformatlock" xmlns:w16se="http://schemas.microsoft.com/office/word/2015/wordml/symex" xmlns:wpg="http://schemas.microsoft.com/office/word/2010/wordprocessingGroup" xmlns:wpi="http://schemas.microsoft.com/office/word/2010/wordprocessingInk" xmlns:wne="http://schemas.microsoft.com/office/word/2006/wordml" xmlns:wps="http://schemas.microsoft.com/office/word/2010/wordprocessingShape" mc:Ignorable="w14 w15 w16se w16cid w16 w16cex w16sdtdh w16sdtfl w16du wp14">
+<w:endnotes xmlns:wpc="http://schemas.microsoft.com/office/word/2010/wordprocessingCanvas" xmlns:cx="http://schemas.microsoft.com/office/drawing/2014/chartex" xmlns:cx1="http://schemas.microsoft.com/office/drawing/2015/9/8/chartex" xmlns:cx2="http://schemas.microsoft.com/office/drawing/2015/10/21/chartex" xmlns:cx3="http://schemas.microsoft.com/office/drawing/2016/5/9/chartex" xmlns:cx4="http://schemas.microsoft.com/office/drawing/2016/5/10/chartex" xmlns:cx5="http://schemas.microsoft.com/office/drawing/2016/5/11/chartex" xmlns:cx6="http://schemas.microsoft.com/office/drawing/2016/5/12/chartex" xmlns:cx7="http://schemas.microsoft.com/office/drawing/2016/5/13/chartex" xmlns:cx8="http://schemas.microsoft.com/office/drawing/2016/5/14/chartex" xmlns:mc="http://schemas.openxmlformats.org/markup-compatibility/2006" xmlns:m="http://schemas.openxmlformats.org/officeDocument/2006/math" xmlns:aink="http://schemas.microsoft.com/office/drawing/2016/ink" xmlns:am3d="http://schemas.microsoft.com/office/drawing/2017/model3d" xmlns:oel="http://schemas.microsoft.com/office/2019/extlst" xmlns:r="http://schemas.openxmlformats.org/officeDocument/2006/relationships" xmlns:wp14="http://schemas.microsoft.com/office/word/2010/wordprocessingDrawing" xmlns:wp="http://schemas.openxmlformats.org/drawingml/2006/wordprocessingDrawing" xmlns:wpg="http://schemas.microsoft.com/office/word/2010/wordprocessingGroup" xmlns:wpi="http://schemas.microsoft.com/office/word/2010/wordprocessingInk" xmlns:wps="http://schemas.microsoft.com/office/word/2010/wordprocessingShape" xmlns:o="urn:schemas-microsoft-com:office:office" xmlns:v="urn:schemas-microsoft-com:vml" xmlns:w10="urn:schemas-microsoft-com:office:word" xmlns:w="http://schemas.openxmlformats.org/wordprocessingml/2006/main" xmlns:w14="http://schemas.microsoft.com/office/word/2010/wordml" xmlns:w15="http://schemas.microsoft.com/office/word/2012/wordml" xmlns:w16cex="http://schemas.microsoft.com/office/word/2018/wordml/cex" xmlns:w16cid="http://schemas.microsoft.com/office/word/2016/wordml/cid" xmlns:w16="http://schemas.microsoft.com/office/word/2018/wordml" xmlns:w16sdtdh="http://schemas.microsoft.com/office/word/2020/wordml/sdtdatahash" xmlns:w16sdtfl="http://schemas.microsoft.com/office/word/2024/wordml/sdtformatlock" xmlns:w16se="http://schemas.microsoft.com/office/word/2015/wordml/symex" xmlns:w16du="http://schemas.microsoft.com/office/word/2023/wordml/word16du" xmlns:wne="http://schemas.microsoft.com/office/word/2006/wordml" mc:Ignorable="w14 w15 w16se w16cid w16 w16cex w16sdtdh w16sdtfl w16du wp14">
   <w:endnote w:type="separator" w:id="-1">
     <w:p>
       <w:r>
@@ -2640,7 +4244,7 @@
 </file>
 
 <file path=word/footer1.xml><?xml version="1.0" encoding="utf-8"?>
-<w:ftr xmlns:wpc="http://schemas.microsoft.com/office/word/2010/wordprocessingCanvas" xmlns:cx="http://schemas.microsoft.com/office/drawing/2014/chartex" xmlns:cx1="http://schemas.microsoft.com/office/drawing/2015/9/8/chartex" xmlns:cx2="http://schemas.microsoft.com/office/drawing/2015/10/21/chartex" xmlns:cx3="http://schemas.microsoft.com/office/drawing/2016/5/9/chartex" xmlns:cx4="http://schemas.microsoft.com/office/drawing/2016/5/10/chartex" xmlns:cx5="http://schemas.microsoft.com/office/drawing/2016/5/11/chartex" xmlns:cx6="http://schemas.microsoft.com/office/drawing/2016/5/12/chartex" xmlns:cx7="http://schemas.microsoft.com/office/drawing/2016/5/13/chartex" xmlns:cx8="http://schemas.microsoft.com/office/drawing/2016/5/14/chartex" xmlns:mc="http://schemas.openxmlformats.org/markup-compatibility/2006" xmlns:aink="http://schemas.microsoft.com/office/drawing/2016/ink" xmlns:am3d="http://schemas.microsoft.com/office/drawing/2017/model3d" xmlns:o="urn:schemas-microsoft-com:office:office" xmlns:oel="http://schemas.microsoft.com/office/2019/extlst" xmlns:r="http://schemas.openxmlformats.org/officeDocument/2006/relationships" xmlns:m="http://schemas.openxmlformats.org/officeDocument/2006/math" xmlns:v="urn:schemas-microsoft-com:vml" xmlns:wp14="http://schemas.microsoft.com/office/word/2010/wordprocessingDrawing" xmlns:wp="http://schemas.openxmlformats.org/drawingml/2006/wordprocessingDrawing" xmlns:w10="urn:schemas-microsoft-com:office:word" xmlns:w="http://schemas.openxmlformats.org/wordprocessingml/2006/main" xmlns:w14="http://schemas.microsoft.com/office/word/2010/wordml" xmlns:w15="http://schemas.microsoft.com/office/word/2012/wordml" xmlns:w16cei="http://schemas.microsoft.com/office/word/2026/wordml/cei" xmlns:w16cex="http://schemas.microsoft.com/office/word/2018/wordml/cex" xmlns:w16cid="http://schemas.microsoft.com/office/word/2016/wordml/cid" xmlns:w16="http://schemas.microsoft.com/office/word/2018/wordml" xmlns:w16du="http://schemas.microsoft.com/office/word/2023/wordml/word16du" xmlns:w16sdtdh="http://schemas.microsoft.com/office/word/2020/wordml/sdtdatahash" xmlns:w16sdtfl="http://schemas.microsoft.com/office/word/2024/wordml/sdtformatlock" xmlns:w16se="http://schemas.microsoft.com/office/word/2015/wordml/symex" xmlns:wpg="http://schemas.microsoft.com/office/word/2010/wordprocessingGroup" xmlns:wpi="http://schemas.microsoft.com/office/word/2010/wordprocessingInk" xmlns:wne="http://schemas.microsoft.com/office/word/2006/wordml" xmlns:wps="http://schemas.microsoft.com/office/word/2010/wordprocessingShape" mc:Ignorable="w14 w15 w16se w16cid w16 w16cex w16sdtdh w16sdtfl w16du wp14">
+<w:ftr xmlns:wpc="http://schemas.microsoft.com/office/word/2010/wordprocessingCanvas" xmlns:cx="http://schemas.microsoft.com/office/drawing/2014/chartex" xmlns:cx1="http://schemas.microsoft.com/office/drawing/2015/9/8/chartex" xmlns:cx2="http://schemas.microsoft.com/office/drawing/2015/10/21/chartex" xmlns:cx3="http://schemas.microsoft.com/office/drawing/2016/5/9/chartex" xmlns:cx4="http://schemas.microsoft.com/office/drawing/2016/5/10/chartex" xmlns:cx5="http://schemas.microsoft.com/office/drawing/2016/5/11/chartex" xmlns:cx6="http://schemas.microsoft.com/office/drawing/2016/5/12/chartex" xmlns:cx7="http://schemas.microsoft.com/office/drawing/2016/5/13/chartex" xmlns:cx8="http://schemas.microsoft.com/office/drawing/2016/5/14/chartex" xmlns:mc="http://schemas.openxmlformats.org/markup-compatibility/2006" xmlns:m="http://schemas.openxmlformats.org/officeDocument/2006/math" xmlns:aink="http://schemas.microsoft.com/office/drawing/2016/ink" xmlns:am3d="http://schemas.microsoft.com/office/drawing/2017/model3d" xmlns:oel="http://schemas.microsoft.com/office/2019/extlst" xmlns:r="http://schemas.openxmlformats.org/officeDocument/2006/relationships" xmlns:wp14="http://schemas.microsoft.com/office/word/2010/wordprocessingDrawing" xmlns:wp="http://schemas.openxmlformats.org/drawingml/2006/wordprocessingDrawing" xmlns:wpg="http://schemas.microsoft.com/office/word/2010/wordprocessingGroup" xmlns:wpi="http://schemas.microsoft.com/office/word/2010/wordprocessingInk" xmlns:wps="http://schemas.microsoft.com/office/word/2010/wordprocessingShape" xmlns:o="urn:schemas-microsoft-com:office:office" xmlns:v="urn:schemas-microsoft-com:vml" xmlns:w10="urn:schemas-microsoft-com:office:word" xmlns:w="http://schemas.openxmlformats.org/wordprocessingml/2006/main" xmlns:w14="http://schemas.microsoft.com/office/word/2010/wordml" xmlns:w15="http://schemas.microsoft.com/office/word/2012/wordml" xmlns:w16cex="http://schemas.microsoft.com/office/word/2018/wordml/cex" xmlns:w16cid="http://schemas.microsoft.com/office/word/2016/wordml/cid" xmlns:w16="http://schemas.microsoft.com/office/word/2018/wordml" xmlns:w16sdtdh="http://schemas.microsoft.com/office/word/2020/wordml/sdtdatahash" xmlns:w16sdtfl="http://schemas.microsoft.com/office/word/2024/wordml/sdtformatlock" xmlns:w16se="http://schemas.microsoft.com/office/word/2015/wordml/symex" xmlns:w16du="http://schemas.microsoft.com/office/word/2023/wordml/word16du" xmlns:wne="http://schemas.microsoft.com/office/word/2006/wordml" mc:Ignorable="w14 w15 w16se w16cid w16 w16cex w16sdtdh w16sdtfl w16du wp14">
   <w:p>
     <w:pPr>
       <w:rPr>
@@ -2968,12 +4572,18 @@
         <w:rFonts w:eastAsia="Trebuchet MS"/>
       </w:rPr>
     </w:pPr>
+    <w:r>
+      <w:rPr>
+        <w:rFonts w:eastAsia="Trebuchet MS"/>
+      </w:rPr>
+      <w:t>MIGUEL HERRERA – SECTION B – October 07 – Checkpoint 7.1</w:t>
+    </w:r>
   </w:p>
 </w:ftr>
 </file>
 
 <file path=word/footnotes.xml><?xml version="1.0" encoding="utf-8"?>
-<w:footnotes xmlns:wpc="http://schemas.microsoft.com/office/word/2010/wordprocessingCanvas" xmlns:cx="http://schemas.microsoft.com/office/drawing/2014/chartex" xmlns:cx1="http://schemas.microsoft.com/office/drawing/2015/9/8/chartex" xmlns:cx2="http://schemas.microsoft.com/office/drawing/2015/10/21/chartex" xmlns:cx3="http://schemas.microsoft.com/office/drawing/2016/5/9/chartex" xmlns:cx4="http://schemas.microsoft.com/office/drawing/2016/5/10/chartex" xmlns:cx5="http://schemas.microsoft.com/office/drawing/2016/5/11/chartex" xmlns:cx6="http://schemas.microsoft.com/office/drawing/2016/5/12/chartex" xmlns:cx7="http://schemas.microsoft.com/office/drawing/2016/5/13/chartex" xmlns:cx8="http://schemas.microsoft.com/office/drawing/2016/5/14/chartex" xmlns:mc="http://schemas.openxmlformats.org/markup-compatibility/2006" xmlns:aink="http://schemas.microsoft.com/office/drawing/2016/ink" xmlns:am3d="http://schemas.microsoft.com/office/drawing/2017/model3d" xmlns:o="urn:schemas-microsoft-com:office:office" xmlns:oel="http://schemas.microsoft.com/office/2019/extlst" xmlns:r="http://schemas.openxmlformats.org/officeDocument/2006/relationships" xmlns:m="http://schemas.openxmlformats.org/officeDocument/2006/math" xmlns:v="urn:schemas-microsoft-com:vml" xmlns:wp14="http://schemas.microsoft.com/office/word/2010/wordprocessingDrawing" xmlns:wp="http://schemas.openxmlformats.org/drawingml/2006/wordprocessingDrawing" xmlns:w10="urn:schemas-microsoft-com:office:word" xmlns:w="http://schemas.openxmlformats.org/wordprocessingml/2006/main" xmlns:w14="http://schemas.microsoft.com/office/word/2010/wordml" xmlns:w15="http://schemas.microsoft.com/office/word/2012/wordml" xmlns:w16cei="http://schemas.microsoft.com/office/word/2026/wordml/cei" xmlns:w16cex="http://schemas.microsoft.com/office/word/2018/wordml/cex" xmlns:w16cid="http://schemas.microsoft.com/office/word/2016/wordml/cid" xmlns:w16="http://schemas.microsoft.com/office/word/2018/wordml" xmlns:w16du="http://schemas.microsoft.com/office/word/2023/wordml/word16du" xmlns:w16sdtdh="http://schemas.microsoft.com/office/word/2020/wordml/sdtdatahash" xmlns:w16sdtfl="http://schemas.microsoft.com/office/word/2024/wordml/sdtformatlock" xmlns:w16se="http://schemas.microsoft.com/office/word/2015/wordml/symex" xmlns:wpg="http://schemas.microsoft.com/office/word/2010/wordprocessingGroup" xmlns:wpi="http://schemas.microsoft.com/office/word/2010/wordprocessingInk" xmlns:wne="http://schemas.microsoft.com/office/word/2006/wordml" xmlns:wps="http://schemas.microsoft.com/office/word/2010/wordprocessingShape" mc:Ignorable="w14 w15 w16se w16cid w16 w16cex w16sdtdh w16sdtfl w16du wp14">
+<w:footnotes xmlns:wpc="http://schemas.microsoft.com/office/word/2010/wordprocessingCanvas" xmlns:cx="http://schemas.microsoft.com/office/drawing/2014/chartex" xmlns:cx1="http://schemas.microsoft.com/office/drawing/2015/9/8/chartex" xmlns:cx2="http://schemas.microsoft.com/office/drawing/2015/10/21/chartex" xmlns:cx3="http://schemas.microsoft.com/office/drawing/2016/5/9/chartex" xmlns:cx4="http://schemas.microsoft.com/office/drawing/2016/5/10/chartex" xmlns:cx5="http://schemas.microsoft.com/office/drawing/2016/5/11/chartex" xmlns:cx6="http://schemas.microsoft.com/office/drawing/2016/5/12/chartex" xmlns:cx7="http://schemas.microsoft.com/office/drawing/2016/5/13/chartex" xmlns:cx8="http://schemas.microsoft.com/office/drawing/2016/5/14/chartex" xmlns:mc="http://schemas.openxmlformats.org/markup-compatibility/2006" xmlns:m="http://schemas.openxmlformats.org/officeDocument/2006/math" xmlns:aink="http://schemas.microsoft.com/office/drawing/2016/ink" xmlns:am3d="http://schemas.microsoft.com/office/drawing/2017/model3d" xmlns:oel="http://schemas.microsoft.com/office/2019/extlst" xmlns:r="http://schemas.openxmlformats.org/officeDocument/2006/relationships" xmlns:wp14="http://schemas.microsoft.com/office/word/2010/wordprocessingDrawing" xmlns:wp="http://schemas.openxmlformats.org/drawingml/2006/wordprocessingDrawing" xmlns:wpg="http://schemas.microsoft.com/office/word/2010/wordprocessingGroup" xmlns:wpi="http://schemas.microsoft.com/office/word/2010/wordprocessingInk" xmlns:wps="http://schemas.microsoft.com/office/word/2010/wordprocessingShape" xmlns:o="urn:schemas-microsoft-com:office:office" xmlns:v="urn:schemas-microsoft-com:vml" xmlns:w10="urn:schemas-microsoft-com:office:word" xmlns:w="http://schemas.openxmlformats.org/wordprocessingml/2006/main" xmlns:w14="http://schemas.microsoft.com/office/word/2010/wordml" xmlns:w15="http://schemas.microsoft.com/office/word/2012/wordml" xmlns:w16cex="http://schemas.microsoft.com/office/word/2018/wordml/cex" xmlns:w16cid="http://schemas.microsoft.com/office/word/2016/wordml/cid" xmlns:w16="http://schemas.microsoft.com/office/word/2018/wordml" xmlns:w16sdtdh="http://schemas.microsoft.com/office/word/2020/wordml/sdtdatahash" xmlns:w16sdtfl="http://schemas.microsoft.com/office/word/2024/wordml/sdtformatlock" xmlns:w16se="http://schemas.microsoft.com/office/word/2015/wordml/symex" xmlns:w16du="http://schemas.microsoft.com/office/word/2023/wordml/word16du" xmlns:wne="http://schemas.microsoft.com/office/word/2006/wordml" mc:Ignorable="w14 w15 w16se w16cid w16 w16cex w16sdtdh w16sdtfl w16du wp14">
   <w:footnote w:type="separator" w:id="-1">
     <w:p>
       <w:r>
@@ -2992,7 +4602,7 @@
 </file>
 
 <file path=word/header1.xml><?xml version="1.0" encoding="utf-8"?>
-<w:hdr xmlns:wpc="http://schemas.microsoft.com/office/word/2010/wordprocessingCanvas" xmlns:cx="http://schemas.microsoft.com/office/drawing/2014/chartex" xmlns:cx1="http://schemas.microsoft.com/office/drawing/2015/9/8/chartex" xmlns:cx2="http://schemas.microsoft.com/office/drawing/2015/10/21/chartex" xmlns:cx3="http://schemas.microsoft.com/office/drawing/2016/5/9/chartex" xmlns:cx4="http://schemas.microsoft.com/office/drawing/2016/5/10/chartex" xmlns:cx5="http://schemas.microsoft.com/office/drawing/2016/5/11/chartex" xmlns:cx6="http://schemas.microsoft.com/office/drawing/2016/5/12/chartex" xmlns:cx7="http://schemas.microsoft.com/office/drawing/2016/5/13/chartex" xmlns:cx8="http://schemas.microsoft.com/office/drawing/2016/5/14/chartex" xmlns:mc="http://schemas.openxmlformats.org/markup-compatibility/2006" xmlns:aink="http://schemas.microsoft.com/office/drawing/2016/ink" xmlns:am3d="http://schemas.microsoft.com/office/drawing/2017/model3d" xmlns:o="urn:schemas-microsoft-com:office:office" xmlns:oel="http://schemas.microsoft.com/office/2019/extlst" xmlns:r="http://schemas.openxmlformats.org/officeDocument/2006/relationships" xmlns:m="http://schemas.openxmlformats.org/officeDocument/2006/math" xmlns:v="urn:schemas-microsoft-com:vml" xmlns:wp14="http://schemas.microsoft.com/office/word/2010/wordprocessingDrawing" xmlns:wp="http://schemas.openxmlformats.org/drawingml/2006/wordprocessingDrawing" xmlns:w10="urn:schemas-microsoft-com:office:word" xmlns:w="http://schemas.openxmlformats.org/wordprocessingml/2006/main" xmlns:w14="http://schemas.microsoft.com/office/word/2010/wordml" xmlns:w15="http://schemas.microsoft.com/office/word/2012/wordml" xmlns:w16cei="http://schemas.microsoft.com/office/word/2026/wordml/cei" xmlns:w16cex="http://schemas.microsoft.com/office/word/2018/wordml/cex" xmlns:w16cid="http://schemas.microsoft.com/office/word/2016/wordml/cid" xmlns:w16="http://schemas.microsoft.com/office/word/2018/wordml" xmlns:w16du="http://schemas.microsoft.com/office/word/2023/wordml/word16du" xmlns:w16sdtdh="http://schemas.microsoft.com/office/word/2020/wordml/sdtdatahash" xmlns:w16sdtfl="http://schemas.microsoft.com/office/word/2024/wordml/sdtformatlock" xmlns:w16se="http://schemas.microsoft.com/office/word/2015/wordml/symex" xmlns:wpg="http://schemas.microsoft.com/office/word/2010/wordprocessingGroup" xmlns:wpi="http://schemas.microsoft.com/office/word/2010/wordprocessingInk" xmlns:wne="http://schemas.microsoft.com/office/word/2006/wordml" xmlns:wps="http://schemas.microsoft.com/office/word/2010/wordprocessingShape" mc:Ignorable="w14 w15 w16se w16cid w16 w16cex w16sdtdh w16sdtfl w16du wp14">
+<w:hdr xmlns:wpc="http://schemas.microsoft.com/office/word/2010/wordprocessingCanvas" xmlns:cx="http://schemas.microsoft.com/office/drawing/2014/chartex" xmlns:cx1="http://schemas.microsoft.com/office/drawing/2015/9/8/chartex" xmlns:cx2="http://schemas.microsoft.com/office/drawing/2015/10/21/chartex" xmlns:cx3="http://schemas.microsoft.com/office/drawing/2016/5/9/chartex" xmlns:cx4="http://schemas.microsoft.com/office/drawing/2016/5/10/chartex" xmlns:cx5="http://schemas.microsoft.com/office/drawing/2016/5/11/chartex" xmlns:cx6="http://schemas.microsoft.com/office/drawing/2016/5/12/chartex" xmlns:cx7="http://schemas.microsoft.com/office/drawing/2016/5/13/chartex" xmlns:cx8="http://schemas.microsoft.com/office/drawing/2016/5/14/chartex" xmlns:mc="http://schemas.openxmlformats.org/markup-compatibility/2006" xmlns:m="http://schemas.openxmlformats.org/officeDocument/2006/math" xmlns:aink="http://schemas.microsoft.com/office/drawing/2016/ink" xmlns:am3d="http://schemas.microsoft.com/office/drawing/2017/model3d" xmlns:oel="http://schemas.microsoft.com/office/2019/extlst" xmlns:r="http://schemas.openxmlformats.org/officeDocument/2006/relationships" xmlns:wp14="http://schemas.microsoft.com/office/word/2010/wordprocessingDrawing" xmlns:wp="http://schemas.openxmlformats.org/drawingml/2006/wordprocessingDrawing" xmlns:wpg="http://schemas.microsoft.com/office/word/2010/wordprocessingGroup" xmlns:wpi="http://schemas.microsoft.com/office/word/2010/wordprocessingInk" xmlns:wps="http://schemas.microsoft.com/office/word/2010/wordprocessingShape" xmlns:o="urn:schemas-microsoft-com:office:office" xmlns:v="urn:schemas-microsoft-com:vml" xmlns:w10="urn:schemas-microsoft-com:office:word" xmlns:w="http://schemas.openxmlformats.org/wordprocessingml/2006/main" xmlns:w14="http://schemas.microsoft.com/office/word/2010/wordml" xmlns:w15="http://schemas.microsoft.com/office/word/2012/wordml" xmlns:w16cex="http://schemas.microsoft.com/office/word/2018/wordml/cex" xmlns:w16cid="http://schemas.microsoft.com/office/word/2016/wordml/cid" xmlns:w16="http://schemas.microsoft.com/office/word/2018/wordml" xmlns:w16sdtdh="http://schemas.microsoft.com/office/word/2020/wordml/sdtdatahash" xmlns:w16sdtfl="http://schemas.microsoft.com/office/word/2024/wordml/sdtformatlock" xmlns:w16se="http://schemas.microsoft.com/office/word/2015/wordml/symex" xmlns:w16du="http://schemas.microsoft.com/office/word/2023/wordml/word16du" xmlns:wne="http://schemas.microsoft.com/office/word/2006/wordml" mc:Ignorable="w14 w15 w16se w16cid w16 w16cex w16sdtdh w16sdtfl w16du wp14">
   <w:p>
     <w:r>
       <w:rPr>
@@ -3047,7 +4657,7 @@
 </file>
 
 <file path=word/header2.xml><?xml version="1.0" encoding="utf-8"?>
-<w:hdr xmlns:wpc="http://schemas.microsoft.com/office/word/2010/wordprocessingCanvas" xmlns:cx="http://schemas.microsoft.com/office/drawing/2014/chartex" xmlns:cx1="http://schemas.microsoft.com/office/drawing/2015/9/8/chartex" xmlns:cx2="http://schemas.microsoft.com/office/drawing/2015/10/21/chartex" xmlns:cx3="http://schemas.microsoft.com/office/drawing/2016/5/9/chartex" xmlns:cx4="http://schemas.microsoft.com/office/drawing/2016/5/10/chartex" xmlns:cx5="http://schemas.microsoft.com/office/drawing/2016/5/11/chartex" xmlns:cx6="http://schemas.microsoft.com/office/drawing/2016/5/12/chartex" xmlns:cx7="http://schemas.microsoft.com/office/drawing/2016/5/13/chartex" xmlns:cx8="http://schemas.microsoft.com/office/drawing/2016/5/14/chartex" xmlns:mc="http://schemas.openxmlformats.org/markup-compatibility/2006" xmlns:aink="http://schemas.microsoft.com/office/drawing/2016/ink" xmlns:am3d="http://schemas.microsoft.com/office/drawing/2017/model3d" xmlns:o="urn:schemas-microsoft-com:office:office" xmlns:oel="http://schemas.microsoft.com/office/2019/extlst" xmlns:r="http://schemas.openxmlformats.org/officeDocument/2006/relationships" xmlns:m="http://schemas.openxmlformats.org/officeDocument/2006/math" xmlns:v="urn:schemas-microsoft-com:vml" xmlns:wp14="http://schemas.microsoft.com/office/word/2010/wordprocessingDrawing" xmlns:wp="http://schemas.openxmlformats.org/drawingml/2006/wordprocessingDrawing" xmlns:w10="urn:schemas-microsoft-com:office:word" xmlns:w="http://schemas.openxmlformats.org/wordprocessingml/2006/main" xmlns:w14="http://schemas.microsoft.com/office/word/2010/wordml" xmlns:w15="http://schemas.microsoft.com/office/word/2012/wordml" xmlns:w16cei="http://schemas.microsoft.com/office/word/2026/wordml/cei" xmlns:w16cex="http://schemas.microsoft.com/office/word/2018/wordml/cex" xmlns:w16cid="http://schemas.microsoft.com/office/word/2016/wordml/cid" xmlns:w16="http://schemas.microsoft.com/office/word/2018/wordml" xmlns:w16du="http://schemas.microsoft.com/office/word/2023/wordml/word16du" xmlns:w16sdtdh="http://schemas.microsoft.com/office/word/2020/wordml/sdtdatahash" xmlns:w16sdtfl="http://schemas.microsoft.com/office/word/2024/wordml/sdtformatlock" xmlns:w16se="http://schemas.microsoft.com/office/word/2015/wordml/symex" xmlns:wpg="http://schemas.microsoft.com/office/word/2010/wordprocessingGroup" xmlns:wpi="http://schemas.microsoft.com/office/word/2010/wordprocessingInk" xmlns:wne="http://schemas.microsoft.com/office/word/2006/wordml" xmlns:wps="http://schemas.microsoft.com/office/word/2010/wordprocessingShape" mc:Ignorable="w14 w15 w16se w16cid w16 w16cex w16sdtdh w16sdtfl w16du wp14">
+<w:hdr xmlns:wpc="http://schemas.microsoft.com/office/word/2010/wordprocessingCanvas" xmlns:cx="http://schemas.microsoft.com/office/drawing/2014/chartex" xmlns:cx1="http://schemas.microsoft.com/office/drawing/2015/9/8/chartex" xmlns:cx2="http://schemas.microsoft.com/office/drawing/2015/10/21/chartex" xmlns:cx3="http://schemas.microsoft.com/office/drawing/2016/5/9/chartex" xmlns:cx4="http://schemas.microsoft.com/office/drawing/2016/5/10/chartex" xmlns:cx5="http://schemas.microsoft.com/office/drawing/2016/5/11/chartex" xmlns:cx6="http://schemas.microsoft.com/office/drawing/2016/5/12/chartex" xmlns:cx7="http://schemas.microsoft.com/office/drawing/2016/5/13/chartex" xmlns:cx8="http://schemas.microsoft.com/office/drawing/2016/5/14/chartex" xmlns:mc="http://schemas.openxmlformats.org/markup-compatibility/2006" xmlns:m="http://schemas.openxmlformats.org/officeDocument/2006/math" xmlns:aink="http://schemas.microsoft.com/office/drawing/2016/ink" xmlns:am3d="http://schemas.microsoft.com/office/drawing/2017/model3d" xmlns:oel="http://schemas.microsoft.com/office/2019/extlst" xmlns:r="http://schemas.openxmlformats.org/officeDocument/2006/relationships" xmlns:wp14="http://schemas.microsoft.com/office/word/2010/wordprocessingDrawing" xmlns:wp="http://schemas.openxmlformats.org/drawingml/2006/wordprocessingDrawing" xmlns:wpg="http://schemas.microsoft.com/office/word/2010/wordprocessingGroup" xmlns:wpi="http://schemas.microsoft.com/office/word/2010/wordprocessingInk" xmlns:wps="http://schemas.microsoft.com/office/word/2010/wordprocessingShape" xmlns:o="urn:schemas-microsoft-com:office:office" xmlns:v="urn:schemas-microsoft-com:vml" xmlns:w10="urn:schemas-microsoft-com:office:word" xmlns:w="http://schemas.openxmlformats.org/wordprocessingml/2006/main" xmlns:w14="http://schemas.microsoft.com/office/word/2010/wordml" xmlns:w15="http://schemas.microsoft.com/office/word/2012/wordml" xmlns:w16cex="http://schemas.microsoft.com/office/word/2018/wordml/cex" xmlns:w16cid="http://schemas.microsoft.com/office/word/2016/wordml/cid" xmlns:w16="http://schemas.microsoft.com/office/word/2018/wordml" xmlns:w16sdtdh="http://schemas.microsoft.com/office/word/2020/wordml/sdtdatahash" xmlns:w16sdtfl="http://schemas.microsoft.com/office/word/2024/wordml/sdtformatlock" xmlns:w16se="http://schemas.microsoft.com/office/word/2015/wordml/symex" xmlns:w16du="http://schemas.microsoft.com/office/word/2023/wordml/word16du" xmlns:wne="http://schemas.microsoft.com/office/word/2006/wordml" mc:Ignorable="w14 w15 w16se w16cid w16 w16cex w16sdtdh w16sdtfl w16du wp14">
   <w:p>
     <w:pPr>
       <w:rPr>
@@ -3267,7 +4877,7 @@
             </wp:anchor>
           </w:drawing>
         </mc:Choice>
-        <mc:Fallback>
+        <mc:Fallback xmlns:w16cei="http://schemas.microsoft.com/office/word/2026/wordml/cei">
           <w:pict>
             <v:rect w14:anchorId="7BFEDCE6" id="Rectangle 1" o:spid="_x0000_s1026" alt="&quot;&quot;" style="position:absolute;margin-left:-28.85pt;margin-top:-2.35pt;width:612.5pt;height:70pt;z-index:251657215;visibility:visible;mso-wrap-style:square;mso-wrap-distance-left:9pt;mso-wrap-distance-top:0;mso-wrap-distance-right:9pt;mso-wrap-distance-bottom:0;mso-position-horizontal:absolute;mso-position-horizontal-relative:text;mso-position-vertical:absolute;mso-position-vertical-relative:text;v-text-anchor:middle" o:gfxdata="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" fillcolor="#a31f34" stroked="f" strokeweight="2pt"/>
           </w:pict>
@@ -3279,7 +4889,7 @@
 </file>
 
 <file path=word/header3.xml><?xml version="1.0" encoding="utf-8"?>
-<w:hdr xmlns:wpc="http://schemas.microsoft.com/office/word/2010/wordprocessingCanvas" xmlns:cx="http://schemas.microsoft.com/office/drawing/2014/chartex" xmlns:cx1="http://schemas.microsoft.com/office/drawing/2015/9/8/chartex" xmlns:cx2="http://schemas.microsoft.com/office/drawing/2015/10/21/chartex" xmlns:cx3="http://schemas.microsoft.com/office/drawing/2016/5/9/chartex" xmlns:cx4="http://schemas.microsoft.com/office/drawing/2016/5/10/chartex" xmlns:cx5="http://schemas.microsoft.com/office/drawing/2016/5/11/chartex" xmlns:cx6="http://schemas.microsoft.com/office/drawing/2016/5/12/chartex" xmlns:cx7="http://schemas.microsoft.com/office/drawing/2016/5/13/chartex" xmlns:cx8="http://schemas.microsoft.com/office/drawing/2016/5/14/chartex" xmlns:mc="http://schemas.openxmlformats.org/markup-compatibility/2006" xmlns:aink="http://schemas.microsoft.com/office/drawing/2016/ink" xmlns:am3d="http://schemas.microsoft.com/office/drawing/2017/model3d" xmlns:o="urn:schemas-microsoft-com:office:office" xmlns:oel="http://schemas.microsoft.com/office/2019/extlst" xmlns:r="http://schemas.openxmlformats.org/officeDocument/2006/relationships" xmlns:m="http://schemas.openxmlformats.org/officeDocument/2006/math" xmlns:v="urn:schemas-microsoft-com:vml" xmlns:wp14="http://schemas.microsoft.com/office/word/2010/wordprocessingDrawing" xmlns:wp="http://schemas.openxmlformats.org/drawingml/2006/wordprocessingDrawing" xmlns:w10="urn:schemas-microsoft-com:office:word" xmlns:w="http://schemas.openxmlformats.org/wordprocessingml/2006/main" xmlns:w14="http://schemas.microsoft.com/office/word/2010/wordml" xmlns:w15="http://schemas.microsoft.com/office/word/2012/wordml" xmlns:w16cei="http://schemas.microsoft.com/office/word/2026/wordml/cei" xmlns:w16cex="http://schemas.microsoft.com/office/word/2018/wordml/cex" xmlns:w16cid="http://schemas.microsoft.com/office/word/2016/wordml/cid" xmlns:w16="http://schemas.microsoft.com/office/word/2018/wordml" xmlns:w16du="http://schemas.microsoft.com/office/word/2023/wordml/word16du" xmlns:w16sdtdh="http://schemas.microsoft.com/office/word/2020/wordml/sdtdatahash" xmlns:w16sdtfl="http://schemas.microsoft.com/office/word/2024/wordml/sdtformatlock" xmlns:w16se="http://schemas.microsoft.com/office/word/2015/wordml/symex" xmlns:wpg="http://schemas.microsoft.com/office/word/2010/wordprocessingGroup" xmlns:wpi="http://schemas.microsoft.com/office/word/2010/wordprocessingInk" xmlns:wne="http://schemas.microsoft.com/office/word/2006/wordml" xmlns:wps="http://schemas.microsoft.com/office/word/2010/wordprocessingShape" mc:Ignorable="w14 w15 w16se w16cid w16 w16cex w16sdtdh w16sdtfl w16du wp14">
+<w:hdr xmlns:wpc="http://schemas.microsoft.com/office/word/2010/wordprocessingCanvas" xmlns:cx="http://schemas.microsoft.com/office/drawing/2014/chartex" xmlns:cx1="http://schemas.microsoft.com/office/drawing/2015/9/8/chartex" xmlns:cx2="http://schemas.microsoft.com/office/drawing/2015/10/21/chartex" xmlns:cx3="http://schemas.microsoft.com/office/drawing/2016/5/9/chartex" xmlns:cx4="http://schemas.microsoft.com/office/drawing/2016/5/10/chartex" xmlns:cx5="http://schemas.microsoft.com/office/drawing/2016/5/11/chartex" xmlns:cx6="http://schemas.microsoft.com/office/drawing/2016/5/12/chartex" xmlns:cx7="http://schemas.microsoft.com/office/drawing/2016/5/13/chartex" xmlns:cx8="http://schemas.microsoft.com/office/drawing/2016/5/14/chartex" xmlns:mc="http://schemas.openxmlformats.org/markup-compatibility/2006" xmlns:m="http://schemas.openxmlformats.org/officeDocument/2006/math" xmlns:aink="http://schemas.microsoft.com/office/drawing/2016/ink" xmlns:am3d="http://schemas.microsoft.com/office/drawing/2017/model3d" xmlns:oel="http://schemas.microsoft.com/office/2019/extlst" xmlns:r="http://schemas.openxmlformats.org/officeDocument/2006/relationships" xmlns:wp14="http://schemas.microsoft.com/office/word/2010/wordprocessingDrawing" xmlns:wp="http://schemas.openxmlformats.org/drawingml/2006/wordprocessingDrawing" xmlns:wpg="http://schemas.microsoft.com/office/word/2010/wordprocessingGroup" xmlns:wpi="http://schemas.microsoft.com/office/word/2010/wordprocessingInk" xmlns:wps="http://schemas.microsoft.com/office/word/2010/wordprocessingShape" xmlns:o="urn:schemas-microsoft-com:office:office" xmlns:v="urn:schemas-microsoft-com:vml" xmlns:w10="urn:schemas-microsoft-com:office:word" xmlns:w="http://schemas.openxmlformats.org/wordprocessingml/2006/main" xmlns:w14="http://schemas.microsoft.com/office/word/2010/wordml" xmlns:w15="http://schemas.microsoft.com/office/word/2012/wordml" xmlns:w16cex="http://schemas.microsoft.com/office/word/2018/wordml/cex" xmlns:w16cid="http://schemas.microsoft.com/office/word/2016/wordml/cid" xmlns:w16="http://schemas.microsoft.com/office/word/2018/wordml" xmlns:w16sdtdh="http://schemas.microsoft.com/office/word/2020/wordml/sdtdatahash" xmlns:w16sdtfl="http://schemas.microsoft.com/office/word/2024/wordml/sdtformatlock" xmlns:w16se="http://schemas.microsoft.com/office/word/2015/wordml/symex" xmlns:w16du="http://schemas.microsoft.com/office/word/2023/wordml/word16du" xmlns:wne="http://schemas.microsoft.com/office/word/2006/wordml" mc:Ignorable="w14 w15 w16se w16cid w16 w16cex w16sdtdh w16sdtfl w16du wp14">
   <w:p>
     <w:r>
       <w:rPr>
@@ -3334,7 +4944,7 @@
 </file>
 
 <file path=word/numbering.xml><?xml version="1.0" encoding="utf-8"?>
-<w:numbering xmlns:wpc="http://schemas.microsoft.com/office/word/2010/wordprocessingCanvas" xmlns:cx="http://schemas.microsoft.com/office/drawing/2014/chartex" xmlns:cx1="http://schemas.microsoft.com/office/drawing/2015/9/8/chartex" xmlns:cx2="http://schemas.microsoft.com/office/drawing/2015/10/21/chartex" xmlns:cx3="http://schemas.microsoft.com/office/drawing/2016/5/9/chartex" xmlns:cx4="http://schemas.microsoft.com/office/drawing/2016/5/10/chartex" xmlns:cx5="http://schemas.microsoft.com/office/drawing/2016/5/11/chartex" xmlns:cx6="http://schemas.microsoft.com/office/drawing/2016/5/12/chartex" xmlns:cx7="http://schemas.microsoft.com/office/drawing/2016/5/13/chartex" xmlns:cx8="http://schemas.microsoft.com/office/drawing/2016/5/14/chartex" xmlns:mc="http://schemas.openxmlformats.org/markup-compatibility/2006" xmlns:aink="http://schemas.microsoft.com/office/drawing/2016/ink" xmlns:am3d="http://schemas.microsoft.com/office/drawing/2017/model3d" xmlns:o="urn:schemas-microsoft-com:office:office" xmlns:oel="http://schemas.microsoft.com/office/2019/extlst" xmlns:r="http://schemas.openxmlformats.org/officeDocument/2006/relationships" xmlns:m="http://schemas.openxmlformats.org/officeDocument/2006/math" xmlns:v="urn:schemas-microsoft-com:vml" xmlns:wp14="http://schemas.microsoft.com/office/word/2010/wordprocessingDrawing" xmlns:wp="http://schemas.openxmlformats.org/drawingml/2006/wordprocessingDrawing" xmlns:w10="urn:schemas-microsoft-com:office:word" xmlns:w="http://schemas.openxmlformats.org/wordprocessingml/2006/main" xmlns:w14="http://schemas.microsoft.com/office/word/2010/wordml" xmlns:w15="http://schemas.microsoft.com/office/word/2012/wordml" xmlns:w16cei="http://schemas.microsoft.com/office/word/2026/wordml/cei" xmlns:w16cex="http://schemas.microsoft.com/office/word/2018/wordml/cex" xmlns:w16cid="http://schemas.microsoft.com/office/word/2016/wordml/cid" xmlns:w16="http://schemas.microsoft.com/office/word/2018/wordml" xmlns:w16du="http://schemas.microsoft.com/office/word/2023/wordml/word16du" xmlns:w16sdtdh="http://schemas.microsoft.com/office/word/2020/wordml/sdtdatahash" xmlns:w16sdtfl="http://schemas.microsoft.com/office/word/2024/wordml/sdtformatlock" xmlns:w16se="http://schemas.microsoft.com/office/word/2015/wordml/symex" xmlns:wpg="http://schemas.microsoft.com/office/word/2010/wordprocessingGroup" xmlns:wpi="http://schemas.microsoft.com/office/word/2010/wordprocessingInk" xmlns:wne="http://schemas.microsoft.com/office/word/2006/wordml" xmlns:wps="http://schemas.microsoft.com/office/word/2010/wordprocessingShape" mc:Ignorable="w14 w15 w16se w16cid w16 w16cex w16sdtdh w16sdtfl w16du wp14">
+<w:numbering xmlns:wpc="http://schemas.microsoft.com/office/word/2010/wordprocessingCanvas" xmlns:cx="http://schemas.microsoft.com/office/drawing/2014/chartex" xmlns:cx1="http://schemas.microsoft.com/office/drawing/2015/9/8/chartex" xmlns:cx2="http://schemas.microsoft.com/office/drawing/2015/10/21/chartex" xmlns:cx3="http://schemas.microsoft.com/office/drawing/2016/5/9/chartex" xmlns:cx4="http://schemas.microsoft.com/office/drawing/2016/5/10/chartex" xmlns:cx5="http://schemas.microsoft.com/office/drawing/2016/5/11/chartex" xmlns:cx6="http://schemas.microsoft.com/office/drawing/2016/5/12/chartex" xmlns:cx7="http://schemas.microsoft.com/office/drawing/2016/5/13/chartex" xmlns:cx8="http://schemas.microsoft.com/office/drawing/2016/5/14/chartex" xmlns:mc="http://schemas.openxmlformats.org/markup-compatibility/2006" xmlns:m="http://schemas.openxmlformats.org/officeDocument/2006/math" xmlns:aink="http://schemas.microsoft.com/office/drawing/2016/ink" xmlns:am3d="http://schemas.microsoft.com/office/drawing/2017/model3d" xmlns:oel="http://schemas.microsoft.com/office/2019/extlst" xmlns:r="http://schemas.openxmlformats.org/officeDocument/2006/relationships" xmlns:wp14="http://schemas.microsoft.com/office/word/2010/wordprocessingDrawing" xmlns:wp="http://schemas.openxmlformats.org/drawingml/2006/wordprocessingDrawing" xmlns:wpg="http://schemas.microsoft.com/office/word/2010/wordprocessingGroup" xmlns:wpi="http://schemas.microsoft.com/office/word/2010/wordprocessingInk" xmlns:wps="http://schemas.microsoft.com/office/word/2010/wordprocessingShape" xmlns:o="urn:schemas-microsoft-com:office:office" xmlns:v="urn:schemas-microsoft-com:vml" xmlns:w10="urn:schemas-microsoft-com:office:word" xmlns:w="http://schemas.openxmlformats.org/wordprocessingml/2006/main" xmlns:w14="http://schemas.microsoft.com/office/word/2010/wordml" xmlns:w15="http://schemas.microsoft.com/office/word/2012/wordml" xmlns:w16cex="http://schemas.microsoft.com/office/word/2018/wordml/cex" xmlns:w16cid="http://schemas.microsoft.com/office/word/2016/wordml/cid" xmlns:w16="http://schemas.microsoft.com/office/word/2018/wordml" xmlns:w16sdtdh="http://schemas.microsoft.com/office/word/2020/wordml/sdtdatahash" xmlns:w16sdtfl="http://schemas.microsoft.com/office/word/2024/wordml/sdtformatlock" xmlns:w16se="http://schemas.microsoft.com/office/word/2015/wordml/symex" xmlns:w16du="http://schemas.microsoft.com/office/word/2023/wordml/word16du" xmlns:wne="http://schemas.microsoft.com/office/word/2006/wordml" mc:Ignorable="w14 w15 w16se w16cid w16 w16cex w16sdtdh w16sdtfl w16du wp14">
   <w:abstractNum w:abstractNumId="0" w15:restartNumberingAfterBreak="0">
     <w:nsid w:val="0B671CFC"/>
     <w:multiLevelType w:val="hybridMultilevel"/>
@@ -5875,6 +7485,119 @@
     </w:lvl>
   </w:abstractNum>
   <w:abstractNum w:abstractNumId="23" w15:restartNumberingAfterBreak="0">
+    <w:nsid w:val="5FFA31B1"/>
+    <w:multiLevelType w:val="hybridMultilevel"/>
+    <w:tmpl w:val="0B424CA4"/>
+    <w:lvl w:ilvl="0" w:tplc="04090001">
+      <w:start w:val="1"/>
+      <w:numFmt w:val="bullet"/>
+      <w:lvlText w:val=""/>
+      <w:lvlJc w:val="left"/>
+      <w:pPr>
+        <w:ind w:left="720" w:hanging="360"/>
+      </w:pPr>
+      <w:rPr>
+        <w:rFonts w:ascii="Symbol" w:hAnsi="Symbol" w:hint="default"/>
+      </w:rPr>
+    </w:lvl>
+    <w:lvl w:ilvl="1" w:tplc="04090003" w:tentative="1">
+      <w:start w:val="1"/>
+      <w:numFmt w:val="bullet"/>
+      <w:lvlText w:val="o"/>
+      <w:lvlJc w:val="left"/>
+      <w:pPr>
+        <w:ind w:left="1440" w:hanging="360"/>
+      </w:pPr>
+      <w:rPr>
+        <w:rFonts w:ascii="Courier New" w:hAnsi="Courier New" w:cs="Courier New" w:hint="default"/>
+      </w:rPr>
+    </w:lvl>
+    <w:lvl w:ilvl="2" w:tplc="04090005" w:tentative="1">
+      <w:start w:val="1"/>
+      <w:numFmt w:val="bullet"/>
+      <w:lvlText w:val=""/>
+      <w:lvlJc w:val="left"/>
+      <w:pPr>
+        <w:ind w:left="2160" w:hanging="360"/>
+      </w:pPr>
+      <w:rPr>
+        <w:rFonts w:ascii="Wingdings" w:hAnsi="Wingdings" w:hint="default"/>
+      </w:rPr>
+    </w:lvl>
+    <w:lvl w:ilvl="3" w:tplc="04090001" w:tentative="1">
+      <w:start w:val="1"/>
+      <w:numFmt w:val="bullet"/>
+      <w:lvlText w:val=""/>
+      <w:lvlJc w:val="left"/>
+      <w:pPr>
+        <w:ind w:left="2880" w:hanging="360"/>
+      </w:pPr>
+      <w:rPr>
+        <w:rFonts w:ascii="Symbol" w:hAnsi="Symbol" w:hint="default"/>
+      </w:rPr>
+    </w:lvl>
+    <w:lvl w:ilvl="4" w:tplc="04090003" w:tentative="1">
+      <w:start w:val="1"/>
+      <w:numFmt w:val="bullet"/>
+      <w:lvlText w:val="o"/>
+      <w:lvlJc w:val="left"/>
+      <w:pPr>
+        <w:ind w:left="3600" w:hanging="360"/>
+      </w:pPr>
+      <w:rPr>
+        <w:rFonts w:ascii="Courier New" w:hAnsi="Courier New" w:cs="Courier New" w:hint="default"/>
+      </w:rPr>
+    </w:lvl>
+    <w:lvl w:ilvl="5" w:tplc="04090005" w:tentative="1">
+      <w:start w:val="1"/>
+      <w:numFmt w:val="bullet"/>
+      <w:lvlText w:val=""/>
+      <w:lvlJc w:val="left"/>
+      <w:pPr>
+        <w:ind w:left="4320" w:hanging="360"/>
+      </w:pPr>
+      <w:rPr>
+        <w:rFonts w:ascii="Wingdings" w:hAnsi="Wingdings" w:hint="default"/>
+      </w:rPr>
+    </w:lvl>
+    <w:lvl w:ilvl="6" w:tplc="04090001" w:tentative="1">
+      <w:start w:val="1"/>
+      <w:numFmt w:val="bullet"/>
+      <w:lvlText w:val=""/>
+      <w:lvlJc w:val="left"/>
+      <w:pPr>
+        <w:ind w:left="5040" w:hanging="360"/>
+      </w:pPr>
+      <w:rPr>
+        <w:rFonts w:ascii="Symbol" w:hAnsi="Symbol" w:hint="default"/>
+      </w:rPr>
+    </w:lvl>
+    <w:lvl w:ilvl="7" w:tplc="04090003" w:tentative="1">
+      <w:start w:val="1"/>
+      <w:numFmt w:val="bullet"/>
+      <w:lvlText w:val="o"/>
+      <w:lvlJc w:val="left"/>
+      <w:pPr>
+        <w:ind w:left="5760" w:hanging="360"/>
+      </w:pPr>
+      <w:rPr>
+        <w:rFonts w:ascii="Courier New" w:hAnsi="Courier New" w:cs="Courier New" w:hint="default"/>
+      </w:rPr>
+    </w:lvl>
+    <w:lvl w:ilvl="8" w:tplc="04090005" w:tentative="1">
+      <w:start w:val="1"/>
+      <w:numFmt w:val="bullet"/>
+      <w:lvlText w:val=""/>
+      <w:lvlJc w:val="left"/>
+      <w:pPr>
+        <w:ind w:left="6480" w:hanging="360"/>
+      </w:pPr>
+      <w:rPr>
+        <w:rFonts w:ascii="Wingdings" w:hAnsi="Wingdings" w:hint="default"/>
+      </w:rPr>
+    </w:lvl>
+  </w:abstractNum>
+  <w:abstractNum w:abstractNumId="24" w15:restartNumberingAfterBreak="0">
     <w:nsid w:val="651C35CB"/>
     <w:multiLevelType w:val="hybridMultilevel"/>
     <w:tmpl w:val="CDDC0CE2"/>
@@ -5987,7 +7710,7 @@
       </w:rPr>
     </w:lvl>
   </w:abstractNum>
-  <w:abstractNum w:abstractNumId="24" w15:restartNumberingAfterBreak="0">
+  <w:abstractNum w:abstractNumId="25" w15:restartNumberingAfterBreak="0">
     <w:nsid w:val="669A6E14"/>
     <w:multiLevelType w:val="hybridMultilevel"/>
     <w:tmpl w:val="A7888B28"/>
@@ -6100,7 +7823,7 @@
       </w:rPr>
     </w:lvl>
   </w:abstractNum>
-  <w:abstractNum w:abstractNumId="25" w15:restartNumberingAfterBreak="0">
+  <w:abstractNum w:abstractNumId="26" w15:restartNumberingAfterBreak="0">
     <w:nsid w:val="67D76033"/>
     <w:multiLevelType w:val="hybridMultilevel"/>
     <w:tmpl w:val="82382562"/>
@@ -6213,7 +7936,7 @@
       </w:rPr>
     </w:lvl>
   </w:abstractNum>
-  <w:abstractNum w:abstractNumId="26" w15:restartNumberingAfterBreak="0">
+  <w:abstractNum w:abstractNumId="27" w15:restartNumberingAfterBreak="0">
     <w:nsid w:val="69605B04"/>
     <w:multiLevelType w:val="hybridMultilevel"/>
     <w:tmpl w:val="28FC95FE"/>
@@ -6325,7 +8048,7 @@
       </w:rPr>
     </w:lvl>
   </w:abstractNum>
-  <w:abstractNum w:abstractNumId="27" w15:restartNumberingAfterBreak="0">
+  <w:abstractNum w:abstractNumId="28" w15:restartNumberingAfterBreak="0">
     <w:nsid w:val="71FA4809"/>
     <w:multiLevelType w:val="hybridMultilevel"/>
     <w:tmpl w:val="89701108"/>
@@ -6438,7 +8161,7 @@
       </w:rPr>
     </w:lvl>
   </w:abstractNum>
-  <w:abstractNum w:abstractNumId="28" w15:restartNumberingAfterBreak="0">
+  <w:abstractNum w:abstractNumId="29" w15:restartNumberingAfterBreak="0">
     <w:nsid w:val="73B40194"/>
     <w:multiLevelType w:val="hybridMultilevel"/>
     <w:tmpl w:val="993AB3D0"/>
@@ -6551,7 +8274,7 @@
       </w:rPr>
     </w:lvl>
   </w:abstractNum>
-  <w:abstractNum w:abstractNumId="29" w15:restartNumberingAfterBreak="0">
+  <w:abstractNum w:abstractNumId="30" w15:restartNumberingAfterBreak="0">
     <w:nsid w:val="7E916118"/>
     <w:multiLevelType w:val="multilevel"/>
     <w:tmpl w:val="7DFA4CF2"/>
@@ -6650,7 +8373,7 @@
     <w:abstractNumId w:val="8"/>
   </w:num>
   <w:num w:numId="4" w16cid:durableId="471093407">
-    <w:abstractNumId w:val="29"/>
+    <w:abstractNumId w:val="30"/>
   </w:num>
   <w:num w:numId="5" w16cid:durableId="382753537">
     <w:abstractNumId w:val="15"/>
@@ -6665,13 +8388,13 @@
     <w:abstractNumId w:val="3"/>
   </w:num>
   <w:num w:numId="9" w16cid:durableId="687365158">
-    <w:abstractNumId w:val="23"/>
+    <w:abstractNumId w:val="24"/>
   </w:num>
   <w:num w:numId="10" w16cid:durableId="1020086996">
-    <w:abstractNumId w:val="27"/>
+    <w:abstractNumId w:val="28"/>
   </w:num>
   <w:num w:numId="11" w16cid:durableId="574978211">
-    <w:abstractNumId w:val="24"/>
+    <w:abstractNumId w:val="25"/>
   </w:num>
   <w:num w:numId="12" w16cid:durableId="1959607287">
     <w:abstractNumId w:val="12"/>
@@ -6683,7 +8406,7 @@
     <w:abstractNumId w:val="6"/>
   </w:num>
   <w:num w:numId="15" w16cid:durableId="886914284">
-    <w:abstractNumId w:val="25"/>
+    <w:abstractNumId w:val="26"/>
   </w:num>
   <w:num w:numId="16" w16cid:durableId="259145629">
     <w:abstractNumId w:val="10"/>
@@ -6692,7 +8415,7 @@
     <w:abstractNumId w:val="1"/>
   </w:num>
   <w:num w:numId="18" w16cid:durableId="1555431672">
-    <w:abstractNumId w:val="26"/>
+    <w:abstractNumId w:val="27"/>
   </w:num>
   <w:num w:numId="19" w16cid:durableId="1497573212">
     <w:abstractNumId w:val="14"/>
@@ -6722,7 +8445,7 @@
     <w:abstractNumId w:val="5"/>
   </w:num>
   <w:num w:numId="28" w16cid:durableId="1334576587">
-    <w:abstractNumId w:val="28"/>
+    <w:abstractNumId w:val="29"/>
   </w:num>
   <w:num w:numId="29" w16cid:durableId="2057271039">
     <w:abstractNumId w:val="22"/>
@@ -6730,11 +8453,14 @@
   <w:num w:numId="30" w16cid:durableId="719019261">
     <w:abstractNumId w:val="9"/>
   </w:num>
+  <w:num w:numId="31" w16cid:durableId="544828969">
+    <w:abstractNumId w:val="23"/>
+  </w:num>
 </w:numbering>
 </file>
 
 <file path=word/styles.xml><?xml version="1.0" encoding="utf-8"?>
-<w:styles xmlns:mc="http://schemas.openxmlformats.org/markup-compatibility/2006" xmlns:r="http://schemas.openxmlformats.org/officeDocument/2006/relationships" xmlns:w="http://schemas.openxmlformats.org/wordprocessingml/2006/main" xmlns:w14="http://schemas.microsoft.com/office/word/2010/wordml" xmlns:w15="http://schemas.microsoft.com/office/word/2012/wordml" xmlns:w16cex="http://schemas.microsoft.com/office/word/2018/wordml/cex" xmlns:w16cid="http://schemas.microsoft.com/office/word/2016/wordml/cid" xmlns:w16="http://schemas.microsoft.com/office/word/2018/wordml" xmlns:w16du="http://schemas.microsoft.com/office/word/2023/wordml/word16du" xmlns:w16sdtdh="http://schemas.microsoft.com/office/word/2020/wordml/sdtdatahash" xmlns:w16sdtfl="http://schemas.microsoft.com/office/word/2024/wordml/sdtformatlock" xmlns:w16se="http://schemas.microsoft.com/office/word/2015/wordml/symex" mc:Ignorable="w14 w15 w16se w16cid w16 w16cex w16sdtdh w16sdtfl w16du">
+<w:styles xmlns:mc="http://schemas.openxmlformats.org/markup-compatibility/2006" xmlns:r="http://schemas.openxmlformats.org/officeDocument/2006/relationships" xmlns:w="http://schemas.openxmlformats.org/wordprocessingml/2006/main" xmlns:w14="http://schemas.microsoft.com/office/word/2010/wordml" xmlns:w15="http://schemas.microsoft.com/office/word/2012/wordml" xmlns:w16cex="http://schemas.microsoft.com/office/word/2018/wordml/cex" xmlns:w16cid="http://schemas.microsoft.com/office/word/2016/wordml/cid" xmlns:w16="http://schemas.microsoft.com/office/word/2018/wordml" xmlns:w16sdtdh="http://schemas.microsoft.com/office/word/2020/wordml/sdtdatahash" xmlns:w16sdtfl="http://schemas.microsoft.com/office/word/2024/wordml/sdtformatlock" xmlns:w16se="http://schemas.microsoft.com/office/word/2015/wordml/symex" xmlns:w16du="http://schemas.microsoft.com/office/word/2023/wordml/word16du" mc:Ignorable="w14 w15 w16se w16cid w16 w16cex w16sdtdh w16sdtfl w16du">
   <w:docDefaults>
     <w:rPrDefault>
       <w:rPr>
@@ -7254,6 +8980,7 @@
   <w:style w:type="character" w:default="1" w:styleId="DefaultParagraphFont">
     <w:name w:val="Default Paragraph Font"/>
     <w:uiPriority w:val="1"/>
+    <w:semiHidden/>
     <w:unhideWhenUsed/>
   </w:style>
   <w:style w:type="table" w:default="1" w:styleId="TableNormal">
@@ -7476,6 +9203,30 @@
         <w:insideV w:val="single" w:sz="4" w:space="0" w:color="auto"/>
       </w:tblBorders>
     </w:tblPr>
+  </w:style>
+  <w:style w:type="character" w:styleId="UnresolvedMention">
+    <w:name w:val="Unresolved Mention"/>
+    <w:basedOn w:val="DefaultParagraphFont"/>
+    <w:uiPriority w:val="99"/>
+    <w:semiHidden/>
+    <w:unhideWhenUsed/>
+    <w:rsid w:val="004168B7"/>
+    <w:rPr>
+      <w:color w:val="605E5C"/>
+      <w:shd w:val="clear" w:color="auto" w:fill="E1DFDD"/>
+    </w:rPr>
+  </w:style>
+  <w:style w:type="character" w:styleId="FollowedHyperlink">
+    <w:name w:val="FollowedHyperlink"/>
+    <w:basedOn w:val="DefaultParagraphFont"/>
+    <w:uiPriority w:val="99"/>
+    <w:semiHidden/>
+    <w:unhideWhenUsed/>
+    <w:rsid w:val="00883BC1"/>
+    <w:rPr>
+      <w:color w:val="800080" w:themeColor="followedHyperlink"/>
+      <w:u w:val="single"/>
+    </w:rPr>
   </w:style>
 </w:styles>
 </file>

</xml_diff>